<commit_message>
Update AquiferOpenBibleDictionary content for 2026-10-27 release
</commit_message>
<xml_diff>
--- a/arb/docx/007.content.docx
+++ b/arb/docx/007.content.docx
@@ -19728,7 +19728,23 @@
           <w:cs/>
           <w:lang w:val="ar_AE" w:bidi="ar_AE"/>
         </w:rPr>
-        <w:t>الاستئصال الجراحي لقُلفة العضو التناسلي الذَكري. في زمن الكتاب المُقدَّس، كان الختان هو ختم عهد الله مع إبراهيم (تكوين 17: 1–14). بدأ الختان بوصفه ممارسة قبلية أو دينية قديمة. وفي بعض البلدان الغربية، يُجرى أيضًا للذكور حديثي الولادة لأسباب صحية تتعلق بالنظافة والوقاية. وحيث يُجرى الختان لأسباب طبية، فإنه لا يحمل أي معنى ديني.</w:t>
+        <w:t>الاستئصال الجراحي لقُلفة العضو التناسلي الذَكري. في زمن الكتاب المُقدَّس، كان الختان هو ختم عهد الله مع إبراهيم (</w:t>
+      </w:r>
+      <w:r>
+        <w:rPr>
+          <w:rtl/>
+          <w:cs/>
+          <w:lang w:val="ar_AE" w:bidi="ar_AE"/>
+        </w:rPr>
+        <w:t>تكوين 17: 1–14</w:t>
+      </w:r>
+      <w:r>
+        <w:rPr>
+          <w:rtl/>
+          <w:cs/>
+          <w:lang w:val="ar_AE" w:bidi="ar_AE"/>
+        </w:rPr>
+        <w:t>). بدأ الختان بوصفه ممارسة قبلية أو دينية قديمة. وفي بعض البلدان الغربية، يُجرى أيضًا للذكور حديثي الولادة لأسباب صحية تتعلق بالنظافة والوقاية. وحيث يُجرى الختان لأسباب طبية، فإنه لا يحمل أي معنى ديني.</w:t>
       </w:r>
     </w:p>
     <w:p>
@@ -19851,27 +19867,251 @@
           <w:cs/>
           <w:lang w:val="ar_AE" w:bidi="ar_AE"/>
         </w:rPr>
-        <w:t>يُعتبر طقس الختان أقدم بكثير من الشعب العبراني. فتُظهر رسوم الكهوف أن الختان كان يُمارَس في عصور ما قبل التاريخ. كما تُظهر نقوش المقابر المصرية القديمة، التي ترجع إلى نحو عام 2400 ق.م، أن الختان كان يُمارَس في مصر. وكانت المجموعات التي تُمارِس الختان تَعُيش في كل قارة تقريبًا. تمت مُلاحظة ممارسة هذا الطَّقس بين الهنود في أمريكا الوسطى والجنوبيَّة، والبولينيزيين، وشعوب غينيا الجديدة، والعديد من القبائل الأستراليَّة والأفريقيَّة، والمصريين، والعرب ما قبل الإسلام. لم يُذكَر هذا الطقس في القرآن، ولكن نظرًا لأن محمد كان مختونًا، فإن السُنَّة تُملي على المسلمين الذكور اتِّباع هذه العادة القديمة. يُرجَع النسب العربي إلى إبراهيم من خلال إسماعيل (تكوين 17: 20)، لذا فإن العُمر الشائع عند الختان لدى المُسلمين هو ١٣ عامًا، وذلك لأن إسماعيل اختتنَ وهو في ذلك العمر (آية 25).</w:t>
-      </w:r>
-    </w:p>
-    <w:p>
-      <w:pPr>
-        <w:bidi/>
-      </w:pPr>
-      <w:r>
-        <w:rPr>
-          <w:rtl/>
-          <w:cs/>
-          <w:lang w:val="ar_AE" w:bidi="ar_AE"/>
-        </w:rPr>
-      </w:r>
-      <w:r>
-        <w:rPr>
-          <w:rtl/>
-          <w:cs/>
-          <w:lang w:val="ar_AE" w:bidi="ar_AE"/>
-        </w:rPr>
-        <w:t>يشير إرميا إلى أن الختان كان يُمارَس لدى عدد من الشعوب المجاورة لإسرائيل، بما في ذلك المصريون والأدوميون والعمونيون والموآبيون وسكان البرية (إرميا 9: 25، 26). مع ذلك، لم يَكُن الفلسطينيون يَفعلون ذلك (قضاة 14: 3؛ 15: 18؛ 1 صموئيل 14: 6؛ 17: 26، 36؛ 18: 25، 27؛ 31: 4؛ 2 صموئيل 1: 20؛ 3: 14؛ 1 أخبار الأيام 10: 4).</w:t>
+        <w:t>يُعتبر طقس الختان أقدم بكثير من الشعب العبراني. فتُظهر رسوم الكهوف أن الختان كان يُمارَس في عصور ما قبل التاريخ. كما تُظهر نقوش المقابر المصرية القديمة، التي ترجع إلى نحو عام 2400 ق.م، أن الختان كان يُمارَس في مصر. وكانت المجموعات التي تُمارِس الختان تَعُيش في كل قارة تقريبًا. تمت مُلاحظة ممارسة هذا الطَّقس بين الهنود في أمريكا الوسطى والجنوبيَّة، والبولينيزيين، وشعوب غينيا الجديدة، والعديد من القبائل الأستراليَّة والأفريقيَّة، والمصريين، والعرب ما قبل الإسلام. لم يُذكَر هذا الطقس في القرآن، ولكن نظرًا لأن محمد كان مختونًا، فإن السُنَّة تُملي على المسلمين الذكور اتِّباع هذه العادة القديمة. يُرجَع النسب العربي إلى إبراهيم من خلال إسماعيل (</w:t>
+      </w:r>
+      <w:r>
+        <w:rPr>
+          <w:rtl/>
+          <w:cs/>
+          <w:lang w:val="ar_AE" w:bidi="ar_AE"/>
+        </w:rPr>
+        <w:t>تكوين 17: 20</w:t>
+      </w:r>
+      <w:r>
+        <w:rPr>
+          <w:rtl/>
+          <w:cs/>
+          <w:lang w:val="ar_AE" w:bidi="ar_AE"/>
+        </w:rPr>
+        <w:t xml:space="preserve">)، لذا فإن العُمر الشائع عند الختان لدى المُسلمين هو ١٣ عامًا، وذلك لأن إسماعيل اختتنَ وهو في ذلك العمر (آية </w:t>
+      </w:r>
+      <w:r>
+        <w:rPr>
+          <w:rtl/>
+          <w:cs/>
+          <w:lang w:val="ar_AE" w:bidi="ar_AE"/>
+        </w:rPr>
+        <w:t>25</w:t>
+      </w:r>
+      <w:r>
+        <w:rPr>
+          <w:rtl/>
+          <w:cs/>
+          <w:lang w:val="ar_AE" w:bidi="ar_AE"/>
+        </w:rPr>
+        <w:t>).</w:t>
+      </w:r>
+    </w:p>
+    <w:p>
+      <w:pPr>
+        <w:bidi/>
+      </w:pPr>
+      <w:r>
+        <w:rPr>
+          <w:rtl/>
+          <w:cs/>
+          <w:lang w:val="ar_AE" w:bidi="ar_AE"/>
+        </w:rPr>
+      </w:r>
+      <w:r>
+        <w:rPr>
+          <w:rtl/>
+          <w:cs/>
+          <w:lang w:val="ar_AE" w:bidi="ar_AE"/>
+        </w:rPr>
+        <w:t>يشير إرميا إلى أن الختان كان يُمارَس لدى عدد من الشعوب المجاورة لإسرائيل، بما في ذلك المصريون والأدوميون والعمونيون والموآبيون وسكان البرية (</w:t>
+      </w:r>
+      <w:r>
+        <w:rPr>
+          <w:rtl/>
+          <w:cs/>
+          <w:lang w:val="ar_AE" w:bidi="ar_AE"/>
+        </w:rPr>
+        <w:t>إرميا 9: 25، 26</w:t>
+      </w:r>
+      <w:r>
+        <w:rPr>
+          <w:rtl/>
+          <w:cs/>
+          <w:lang w:val="ar_AE" w:bidi="ar_AE"/>
+        </w:rPr>
+        <w:t>). مع ذلك، لم يَكُن الفلسطينيون يَفعلون ذلك (</w:t>
+      </w:r>
+      <w:r>
+        <w:rPr>
+          <w:rtl/>
+          <w:cs/>
+          <w:lang w:val="ar_AE" w:bidi="ar_AE"/>
+        </w:rPr>
+        <w:t>قضاة 14: 3</w:t>
+      </w:r>
+      <w:r>
+        <w:rPr>
+          <w:rtl/>
+          <w:cs/>
+          <w:lang w:val="ar_AE" w:bidi="ar_AE"/>
+        </w:rPr>
+        <w:t xml:space="preserve">؛ </w:t>
+      </w:r>
+      <w:r>
+        <w:rPr>
+          <w:rtl/>
+          <w:cs/>
+          <w:lang w:val="ar_AE" w:bidi="ar_AE"/>
+        </w:rPr>
+        <w:t>15: 18</w:t>
+      </w:r>
+      <w:r>
+        <w:rPr>
+          <w:rtl/>
+          <w:cs/>
+          <w:lang w:val="ar_AE" w:bidi="ar_AE"/>
+        </w:rPr>
+        <w:t xml:space="preserve">؛ </w:t>
+      </w:r>
+      <w:r>
+        <w:rPr>
+          <w:rtl/>
+          <w:cs/>
+          <w:lang w:val="ar_AE" w:bidi="ar_AE"/>
+        </w:rPr>
+        <w:t>1 صموئيل 14: 6</w:t>
+      </w:r>
+      <w:r>
+        <w:rPr>
+          <w:rtl/>
+          <w:cs/>
+          <w:lang w:val="ar_AE" w:bidi="ar_AE"/>
+        </w:rPr>
+        <w:t xml:space="preserve">؛ </w:t>
+      </w:r>
+      <w:r>
+        <w:rPr>
+          <w:rtl/>
+          <w:cs/>
+          <w:lang w:val="ar_AE" w:bidi="ar_AE"/>
+        </w:rPr>
+        <w:t>17:26</w:t>
+      </w:r>
+      <w:r>
+        <w:rPr>
+          <w:rtl/>
+          <w:cs/>
+          <w:lang w:val="ar_AE" w:bidi="ar_AE"/>
+        </w:rPr>
+        <w:t xml:space="preserve">، </w:t>
+      </w:r>
+      <w:r>
+        <w:rPr>
+          <w:rtl/>
+          <w:cs/>
+          <w:lang w:val="ar_AE" w:bidi="ar_AE"/>
+        </w:rPr>
+        <w:t>36</w:t>
+      </w:r>
+      <w:r>
+        <w:rPr>
+          <w:rtl/>
+          <w:cs/>
+          <w:lang w:val="ar_AE" w:bidi="ar_AE"/>
+        </w:rPr>
+        <w:t xml:space="preserve">؛ </w:t>
+      </w:r>
+      <w:r>
+        <w:rPr>
+          <w:rtl/>
+          <w:cs/>
+          <w:lang w:val="ar_AE" w:bidi="ar_AE"/>
+        </w:rPr>
+        <w:t>18:25</w:t>
+      </w:r>
+      <w:r>
+        <w:rPr>
+          <w:rtl/>
+          <w:cs/>
+          <w:lang w:val="ar_AE" w:bidi="ar_AE"/>
+        </w:rPr>
+        <w:t xml:space="preserve">، </w:t>
+      </w:r>
+      <w:r>
+        <w:rPr>
+          <w:rtl/>
+          <w:cs/>
+          <w:lang w:val="ar_AE" w:bidi="ar_AE"/>
+        </w:rPr>
+        <w:t>27</w:t>
+      </w:r>
+      <w:r>
+        <w:rPr>
+          <w:rtl/>
+          <w:cs/>
+          <w:lang w:val="ar_AE" w:bidi="ar_AE"/>
+        </w:rPr>
+        <w:t xml:space="preserve">؛ </w:t>
+      </w:r>
+      <w:r>
+        <w:rPr>
+          <w:rtl/>
+          <w:cs/>
+          <w:lang w:val="ar_AE" w:bidi="ar_AE"/>
+        </w:rPr>
+        <w:t>31:4</w:t>
+      </w:r>
+      <w:r>
+        <w:rPr>
+          <w:rtl/>
+          <w:cs/>
+          <w:lang w:val="ar_AE" w:bidi="ar_AE"/>
+        </w:rPr>
+        <w:t xml:space="preserve">؛ </w:t>
+      </w:r>
+      <w:r>
+        <w:rPr>
+          <w:rtl/>
+          <w:cs/>
+          <w:lang w:val="ar_AE" w:bidi="ar_AE"/>
+        </w:rPr>
+        <w:t>2 صموئيل 1: 20</w:t>
+      </w:r>
+      <w:r>
+        <w:rPr>
+          <w:rtl/>
+          <w:cs/>
+          <w:lang w:val="ar_AE" w:bidi="ar_AE"/>
+        </w:rPr>
+        <w:t xml:space="preserve">؛ </w:t>
+      </w:r>
+      <w:r>
+        <w:rPr>
+          <w:rtl/>
+          <w:cs/>
+          <w:lang w:val="ar_AE" w:bidi="ar_AE"/>
+        </w:rPr>
+        <w:t>3:14</w:t>
+      </w:r>
+      <w:r>
+        <w:rPr>
+          <w:rtl/>
+          <w:cs/>
+          <w:lang w:val="ar_AE" w:bidi="ar_AE"/>
+        </w:rPr>
+        <w:t xml:space="preserve">؛ </w:t>
+      </w:r>
+      <w:r>
+        <w:rPr>
+          <w:rtl/>
+          <w:cs/>
+          <w:lang w:val="ar_AE" w:bidi="ar_AE"/>
+        </w:rPr>
+        <w:t>1 أخبار الأيام 10: 4</w:t>
+      </w:r>
+      <w:r>
+        <w:rPr>
+          <w:rtl/>
+          <w:cs/>
+          <w:lang w:val="ar_AE" w:bidi="ar_AE"/>
+        </w:rPr>
+        <w:t>).</w:t>
       </w:r>
     </w:p>
     <w:p>
@@ -19925,47 +20165,415 @@
           <w:cs/>
           <w:lang w:val="ar_AE" w:bidi="ar_AE"/>
         </w:rPr>
-        <w:t>بدأت ممارسة الختان في الكتاب المُقدَّس في تكوين 17 باعتباره علامةً على العهد بين الله وإبراهيم. وعدَ اللهُ إبراهيم بأرضً، من خلال ابن سيُحبَل به في المستقبل، وبِنَسلٍ كثير، سيأتي منهم ملوك. كان إبراهيم سينال البركات ومن خلاله سيتبارك جميع الأمم (تكوين 12: 1–3). بعد أن تم تأسيس العهد رسميًا (أصحاح 15)، ختمه اللهُ، آمرًا إبراهيم بأن يَختتن هو وجميع الذكور في بيته (تكوين 17: 9–13).</w:t>
-      </w:r>
-    </w:p>
-    <w:p>
-      <w:pPr>
-        <w:bidi/>
-      </w:pPr>
-      <w:r>
-        <w:rPr>
-          <w:rtl/>
-          <w:cs/>
-          <w:lang w:val="ar_AE" w:bidi="ar_AE"/>
-        </w:rPr>
-      </w:r>
-      <w:r>
-        <w:rPr>
-          <w:rtl/>
-          <w:cs/>
-          <w:lang w:val="ar_AE" w:bidi="ar_AE"/>
-        </w:rPr>
-        <w:t>كان الغرض من الختان هو أن يكون تعبيرًا عن الإيمان بأن وعود الله ستتحقق. لأن إيمان إبراهيم كان قد زلَّ (تكوين 16) حتى بعد أن رأى العرض الرائع لعظمة الله (15: 9–17)، تم وضع تذكير دائم بوعود الله المُتعلِّقة بالعهد على جسد إبراهيم وعلى أجساد نَسله من الذكور (17: 11). ارتبطتْ هذه العلامة ارتباطًا وثيقًا بوعد الله المُتعلِّق بالعهد لدرجة أن الطقس نفسه يمكن أن يُطلق عليه تعبير "العهد" (تكوين 17: 10؛ أعمال الرسل 7: 8).</w:t>
-      </w:r>
-    </w:p>
-    <w:p>
-      <w:pPr>
-        <w:bidi/>
-      </w:pPr>
-      <w:r>
-        <w:rPr>
-          <w:rtl/>
-          <w:cs/>
-          <w:lang w:val="ar_AE" w:bidi="ar_AE"/>
-        </w:rPr>
-      </w:r>
-      <w:r>
-        <w:rPr>
-          <w:rtl/>
-          <w:cs/>
-          <w:lang w:val="ar_AE" w:bidi="ar_AE"/>
-        </w:rPr>
-        <w:t>كان ينبغي القيام بطقس الختان في اليوم الثامن بعد الولادة (تكوين 17: 12؛ ﻻويين 12: 1–3؛ انظر تكوين 21: 4؛ لوقا 1: 59؛ 2: 21؛ أعمال الرسل 7: 8؛ فيلبي 3: 5)، عادةً ما يقوم به والد الصبي (تكوين 17: 23؛ 21: 4؛ أعمال الرسل 7: 8)، ويُعطى الولد اسمًا في ذلك الوقت (لوقا 1: 59؛ 2: 21). كانت تُستخدَم سكاكين الصَّوان في العصور المُبكرة (خروج 4: 25؛ يشوع 5: 2، 3). في وقتٍ لاحق، كان يُنفِّذ الطقس مُمارِسٌ مُدرَّب يُدعى موهِل "mohel</w:t>
+        <w:t xml:space="preserve">بدأت ممارسة الختان في الكتاب المُقدَّس في </w:t>
+      </w:r>
+      <w:r>
+        <w:rPr>
+          <w:rtl/>
+          <w:cs/>
+          <w:lang w:val="ar_AE" w:bidi="ar_AE"/>
+        </w:rPr>
+        <w:t>تكوين 17</w:t>
+      </w:r>
+      <w:r>
+        <w:rPr>
+          <w:rtl/>
+          <w:cs/>
+          <w:lang w:val="ar_AE" w:bidi="ar_AE"/>
+        </w:rPr>
+        <w:t xml:space="preserve"> باعتباره علامةً على العهد بين الله وإبراهيم. وعدَ اللهُ إبراهيم بأرضً، من خلال ابن سيُحبَل به في المستقبل، وبِنَسلٍ كثير، سيأتي منهم ملوك. كان إبراهيم سينال البركات ومن خلاله سيتبارك جميع الأمم (</w:t>
+      </w:r>
+      <w:r>
+        <w:rPr>
+          <w:rtl/>
+          <w:cs/>
+          <w:lang w:val="ar_AE" w:bidi="ar_AE"/>
+        </w:rPr>
+        <w:t>تكوين 12:1–3</w:t>
+      </w:r>
+      <w:r>
+        <w:rPr>
+          <w:rtl/>
+          <w:cs/>
+          <w:lang w:val="ar_AE" w:bidi="ar_AE"/>
+        </w:rPr>
+        <w:t xml:space="preserve">). بعد أن تم تأسيس العهد رسميًا (أصحاح </w:t>
+      </w:r>
+      <w:r>
+        <w:rPr>
+          <w:rtl/>
+          <w:cs/>
+          <w:lang w:val="ar_AE" w:bidi="ar_AE"/>
+        </w:rPr>
+        <w:t>15</w:t>
+      </w:r>
+      <w:r>
+        <w:rPr>
+          <w:rtl/>
+          <w:cs/>
+          <w:lang w:val="ar_AE" w:bidi="ar_AE"/>
+        </w:rPr>
+        <w:t>)، ختمه اللهُ، آمرًا إبراهيم بأن يَختتن هو وجميع الذكور في بيته (</w:t>
+      </w:r>
+      <w:r>
+        <w:rPr>
+          <w:rtl/>
+          <w:cs/>
+          <w:lang w:val="ar_AE" w:bidi="ar_AE"/>
+        </w:rPr>
+        <w:t>تكوين 17:9–13</w:t>
+      </w:r>
+      <w:r>
+        <w:rPr>
+          <w:rtl/>
+          <w:cs/>
+          <w:lang w:val="ar_AE" w:bidi="ar_AE"/>
+        </w:rPr>
+        <w:t>).</w:t>
+      </w:r>
+    </w:p>
+    <w:p>
+      <w:pPr>
+        <w:bidi/>
+      </w:pPr>
+      <w:r>
+        <w:rPr>
+          <w:rtl/>
+          <w:cs/>
+          <w:lang w:val="ar_AE" w:bidi="ar_AE"/>
+        </w:rPr>
+      </w:r>
+      <w:r>
+        <w:rPr>
+          <w:rtl/>
+          <w:cs/>
+          <w:lang w:val="ar_AE" w:bidi="ar_AE"/>
+        </w:rPr>
+        <w:t>كان الغرض من الختان هو أن يكون تعبيرًا عن الإيمان بأن وعود الله ستتحقق. لأن إيمان إبراهيم كان قد زلَّ (</w:t>
+      </w:r>
+      <w:r>
+        <w:rPr>
+          <w:rtl/>
+          <w:cs/>
+          <w:lang w:val="ar_AE" w:bidi="ar_AE"/>
+        </w:rPr>
+        <w:t>تكوين 16</w:t>
+      </w:r>
+      <w:r>
+        <w:rPr>
+          <w:rtl/>
+          <w:cs/>
+          <w:lang w:val="ar_AE" w:bidi="ar_AE"/>
+        </w:rPr>
+        <w:t>) حتى بعد أن رأى العرض الرائع لعظمة الله (</w:t>
+      </w:r>
+      <w:r>
+        <w:rPr>
+          <w:rtl/>
+          <w:cs/>
+          <w:lang w:val="ar_AE" w:bidi="ar_AE"/>
+        </w:rPr>
+        <w:t>15:9–17</w:t>
+      </w:r>
+      <w:r>
+        <w:rPr>
+          <w:rtl/>
+          <w:cs/>
+          <w:lang w:val="ar_AE" w:bidi="ar_AE"/>
+        </w:rPr>
+        <w:t>)، تم وضع تذكير دائم بوعود الله المُتعلِّقة بالعهد على جسد إبراهيم وعلى أجساد نَسله من الذكور (</w:t>
+      </w:r>
+      <w:r>
+        <w:rPr>
+          <w:rtl/>
+          <w:cs/>
+          <w:lang w:val="ar_AE" w:bidi="ar_AE"/>
+        </w:rPr>
+        <w:t>17:11</w:t>
+      </w:r>
+      <w:r>
+        <w:rPr>
+          <w:rtl/>
+          <w:cs/>
+          <w:lang w:val="ar_AE" w:bidi="ar_AE"/>
+        </w:rPr>
+        <w:t>). ارتبطتْ هذه العلامة ارتباطًا وثيقًا بوعد الله المُتعلِّق بالعهد لدرجة أن الطقس نفسه يمكن أن يُطلق عليه تعبير "العهد" (</w:t>
+      </w:r>
+      <w:r>
+        <w:rPr>
+          <w:rtl/>
+          <w:cs/>
+          <w:lang w:val="ar_AE" w:bidi="ar_AE"/>
+        </w:rPr>
+        <w:t>تكوين 17:10</w:t>
+      </w:r>
+      <w:r>
+        <w:rPr>
+          <w:rtl/>
+          <w:cs/>
+          <w:lang w:val="ar_AE" w:bidi="ar_AE"/>
+        </w:rPr>
+        <w:t xml:space="preserve">؛ </w:t>
+      </w:r>
+      <w:r>
+        <w:rPr>
+          <w:rtl/>
+          <w:cs/>
+          <w:lang w:val="ar_AE" w:bidi="ar_AE"/>
+        </w:rPr>
+        <w:t>أعمال الرسل 7: 8</w:t>
+      </w:r>
+      <w:r>
+        <w:rPr>
+          <w:rtl/>
+          <w:cs/>
+          <w:lang w:val="ar_AE" w:bidi="ar_AE"/>
+        </w:rPr>
+        <w:t>).</w:t>
+      </w:r>
+    </w:p>
+    <w:p>
+      <w:pPr>
+        <w:bidi/>
+      </w:pPr>
+      <w:r>
+        <w:rPr>
+          <w:rtl/>
+          <w:cs/>
+          <w:lang w:val="ar_AE" w:bidi="ar_AE"/>
+        </w:rPr>
+      </w:r>
+      <w:r>
+        <w:rPr>
+          <w:rtl/>
+          <w:cs/>
+          <w:lang w:val="ar_AE" w:bidi="ar_AE"/>
+        </w:rPr>
+        <w:t>كان ينبغي القيام بطقس الختان في اليوم الثامن بعد الولادة (</w:t>
+      </w:r>
+      <w:r>
+        <w:rPr>
+          <w:rtl/>
+          <w:cs/>
+          <w:lang w:val="ar_AE" w:bidi="ar_AE"/>
+        </w:rPr>
+        <w:t>تكوين 17:12</w:t>
+      </w:r>
+      <w:r>
+        <w:rPr>
+          <w:rtl/>
+          <w:cs/>
+          <w:lang w:val="ar_AE" w:bidi="ar_AE"/>
+        </w:rPr>
+        <w:t xml:space="preserve">؛ </w:t>
+      </w:r>
+      <w:r>
+        <w:rPr>
+          <w:rtl/>
+          <w:cs/>
+          <w:lang w:val="ar_AE" w:bidi="ar_AE"/>
+        </w:rPr>
+        <w:t>ﻻويين 12: 1–3</w:t>
+      </w:r>
+      <w:r>
+        <w:rPr>
+          <w:rtl/>
+          <w:cs/>
+          <w:lang w:val="ar_AE" w:bidi="ar_AE"/>
+        </w:rPr>
+        <w:t xml:space="preserve">؛ انظر </w:t>
+      </w:r>
+      <w:r>
+        <w:rPr>
+          <w:rtl/>
+          <w:cs/>
+          <w:lang w:val="ar_AE" w:bidi="ar_AE"/>
+        </w:rPr>
+        <w:t>تكوين 21:4</w:t>
+      </w:r>
+      <w:r>
+        <w:rPr>
+          <w:rtl/>
+          <w:cs/>
+          <w:lang w:val="ar_AE" w:bidi="ar_AE"/>
+        </w:rPr>
+        <w:t xml:space="preserve">؛ </w:t>
+      </w:r>
+      <w:r>
+        <w:rPr>
+          <w:rtl/>
+          <w:cs/>
+          <w:lang w:val="ar_AE" w:bidi="ar_AE"/>
+        </w:rPr>
+        <w:t>لوقا 1: 59</w:t>
+      </w:r>
+      <w:r>
+        <w:rPr>
+          <w:rtl/>
+          <w:cs/>
+          <w:lang w:val="ar_AE" w:bidi="ar_AE"/>
+        </w:rPr>
+        <w:t xml:space="preserve">؛ </w:t>
+      </w:r>
+      <w:r>
+        <w:rPr>
+          <w:rtl/>
+          <w:cs/>
+          <w:lang w:val="ar_AE" w:bidi="ar_AE"/>
+        </w:rPr>
+        <w:t>2: 21</w:t>
+      </w:r>
+      <w:r>
+        <w:rPr>
+          <w:rtl/>
+          <w:cs/>
+          <w:lang w:val="ar_AE" w:bidi="ar_AE"/>
+        </w:rPr>
+        <w:t xml:space="preserve">؛ </w:t>
+      </w:r>
+      <w:r>
+        <w:rPr>
+          <w:rtl/>
+          <w:cs/>
+          <w:lang w:val="ar_AE" w:bidi="ar_AE"/>
+        </w:rPr>
+        <w:t>أعمال الرسل 7: 8</w:t>
+      </w:r>
+      <w:r>
+        <w:rPr>
+          <w:rtl/>
+          <w:cs/>
+          <w:lang w:val="ar_AE" w:bidi="ar_AE"/>
+        </w:rPr>
+        <w:t xml:space="preserve">؛ </w:t>
+      </w:r>
+      <w:r>
+        <w:rPr>
+          <w:rtl/>
+          <w:cs/>
+          <w:lang w:val="ar_AE" w:bidi="ar_AE"/>
+        </w:rPr>
+        <w:t>فيلبي 3: 5</w:t>
+      </w:r>
+      <w:r>
+        <w:rPr>
+          <w:rtl/>
+          <w:cs/>
+          <w:lang w:val="ar_AE" w:bidi="ar_AE"/>
+        </w:rPr>
+        <w:t>)، عادةً ما يقوم به والد الصبي (</w:t>
+      </w:r>
+      <w:r>
+        <w:rPr>
+          <w:rtl/>
+          <w:cs/>
+          <w:lang w:val="ar_AE" w:bidi="ar_AE"/>
+        </w:rPr>
+        <w:t>تكوين 17:23</w:t>
+      </w:r>
+      <w:r>
+        <w:rPr>
+          <w:rtl/>
+          <w:cs/>
+          <w:lang w:val="ar_AE" w:bidi="ar_AE"/>
+        </w:rPr>
+        <w:t xml:space="preserve">؛ </w:t>
+      </w:r>
+      <w:r>
+        <w:rPr>
+          <w:rtl/>
+          <w:cs/>
+          <w:lang w:val="ar_AE" w:bidi="ar_AE"/>
+        </w:rPr>
+        <w:t>21:4</w:t>
+      </w:r>
+      <w:r>
+        <w:rPr>
+          <w:rtl/>
+          <w:cs/>
+          <w:lang w:val="ar_AE" w:bidi="ar_AE"/>
+        </w:rPr>
+        <w:t xml:space="preserve">؛ </w:t>
+      </w:r>
+      <w:r>
+        <w:rPr>
+          <w:rtl/>
+          <w:cs/>
+          <w:lang w:val="ar_AE" w:bidi="ar_AE"/>
+        </w:rPr>
+        <w:t>أعمال الرسل 7: 8</w:t>
+      </w:r>
+      <w:r>
+        <w:rPr>
+          <w:rtl/>
+          <w:cs/>
+          <w:lang w:val="ar_AE" w:bidi="ar_AE"/>
+        </w:rPr>
+        <w:t>)، ويُعطى الولد اسمًا في ذلك الوقت (</w:t>
+      </w:r>
+      <w:r>
+        <w:rPr>
+          <w:rtl/>
+          <w:cs/>
+          <w:lang w:val="ar_AE" w:bidi="ar_AE"/>
+        </w:rPr>
+        <w:t>لوقا 1: 59</w:t>
+      </w:r>
+      <w:r>
+        <w:rPr>
+          <w:rtl/>
+          <w:cs/>
+          <w:lang w:val="ar_AE" w:bidi="ar_AE"/>
+        </w:rPr>
+        <w:t xml:space="preserve">؛ </w:t>
+      </w:r>
+      <w:r>
+        <w:rPr>
+          <w:rtl/>
+          <w:cs/>
+          <w:lang w:val="ar_AE" w:bidi="ar_AE"/>
+        </w:rPr>
+        <w:t>2: 21</w:t>
+      </w:r>
+      <w:r>
+        <w:rPr>
+          <w:rtl/>
+          <w:cs/>
+          <w:lang w:val="ar_AE" w:bidi="ar_AE"/>
+        </w:rPr>
+        <w:t>). كانت تُستخدَم سكاكين الصَّوان في العصور المُبكرة (</w:t>
+      </w:r>
+      <w:r>
+        <w:rPr>
+          <w:rtl/>
+          <w:cs/>
+          <w:lang w:val="ar_AE" w:bidi="ar_AE"/>
+        </w:rPr>
+        <w:t>خروج 4: 25</w:t>
+      </w:r>
+      <w:r>
+        <w:rPr>
+          <w:rtl/>
+          <w:cs/>
+          <w:lang w:val="ar_AE" w:bidi="ar_AE"/>
+        </w:rPr>
+        <w:t xml:space="preserve">؛ </w:t>
+      </w:r>
+      <w:r>
+        <w:rPr>
+          <w:rtl/>
+          <w:cs/>
+          <w:lang w:val="ar_AE" w:bidi="ar_AE"/>
+        </w:rPr>
+        <w:t>يشوع 5: 2، 3</w:t>
+      </w:r>
+      <w:r>
+        <w:rPr>
+          <w:rtl/>
+          <w:cs/>
+          <w:lang w:val="ar_AE" w:bidi="ar_AE"/>
+        </w:rPr>
+        <w:t>). في وقتٍ لاحق، كان يُنفِّذ الطقس مُمارِسٌ مُدرَّب يُدعى موهِل "mohel</w:t>
       </w:r>
       <w:r>
         <w:rPr>
@@ -20016,47 +20624,143 @@
           <w:cs/>
           <w:lang w:val="ar_AE" w:bidi="ar_AE"/>
         </w:rPr>
-        <w:t>كان الختان يَتعلَّق بتحقيق وعد الله بخصوص نَسل إبراهيم (تكوين 17: 9–12). نظرًا لأن الطقس يتم في العضو التناسلي، كانت العلامة تَتعلَّق بنمو ذلك النَسل. إن القيام به على الرضيع البالغ من العمر ثماني أيام يُبرهن الطبيعة المُنعمة لوعد الله لنَسل إبراهيم، ويُشير إلى أن شعب الله يحتاجون إلى النعمة المُطهرة منذ الولادة (لاويين 12: 1–3). كانت وعود العهد تُؤكَّد مجدَّدًا لكل جيلٍ قبل أن يَستطيع مُستقبِلي الختان أن يَتجاوبوا إما بالإيمان أو بعدم الإيمان. لا يوجد في قلوب الشعب المُختار ما يمكنه أن يُؤثِّر على التحقيق النهائي للوعود التي أُعطيت لإبراهيم ونسله.</w:t>
-      </w:r>
-    </w:p>
-    <w:p>
-      <w:pPr>
-        <w:bidi/>
-      </w:pPr>
-      <w:r>
-        <w:rPr>
-          <w:rtl/>
-          <w:cs/>
-          <w:lang w:val="ar_AE" w:bidi="ar_AE"/>
-        </w:rPr>
-      </w:r>
-      <w:r>
-        <w:rPr>
-          <w:rtl/>
-          <w:cs/>
-          <w:lang w:val="ar_AE" w:bidi="ar_AE"/>
-        </w:rPr>
-        <w:t>كان الختان يَتعلَّق أيضًا بتحقيق وعد الله بخصوص الأرض (تكوين 17: 8). كانت الأرض مِلكيَّة مُقدَّسة لله، وكان يجب أن يكون شعب إسرائيل مُقدَّسين ليمتلكوها. عندما كان يوسف ونسله في مصر، استمروا في ختان أبنائهم. لكن بعد الخطية الكبيرة عند جبل سيناء بعد الخروج، فشلَ شعب إسرائيل غير المؤمن في وضع علامة العهد على أولادهم بينما كانوا يدورون في البرية. ولأن الجيل الجديد لم يكن قد تم ختانه، كان الشعب غير مُستعدٍ لأن يَدخل أرض الموعد. لذلك، أمرَ اللهُ يشوع بأن يَختن رجال إسرائيل. كان التجاوب المُطيع للشعب فعلَ إيمانٍ، لأن جيوش العدو كانت مُخيِّمة بالقرب منهم بينما كان مُحاربو إسرائيل مُقعدين يتعافون من العمليَّة الجراحيَّة (يشوع 5: 2–9).</w:t>
-      </w:r>
-    </w:p>
-    <w:p>
-      <w:pPr>
-        <w:bidi/>
-      </w:pPr>
-      <w:r>
-        <w:rPr>
-          <w:rtl/>
-          <w:cs/>
-          <w:lang w:val="ar_AE" w:bidi="ar_AE"/>
-        </w:rPr>
-      </w:r>
-      <w:r>
-        <w:rPr>
-          <w:rtl/>
-          <w:cs/>
-          <w:lang w:val="ar_AE" w:bidi="ar_AE"/>
-        </w:rPr>
-        <w:t>منذ البداية، كان الاشتراك في وعود العهد مُتاحة لأشخاص من خارج بيت إبراهيم (تكوين 17: 12، 13). يُعطي نَصُّ خروج 12: 43–49 غير الإسرائيليين الفرصةَ للاشتراك في الفِصح إذا كانوا راغبين في إتمام نفس الشرط المفروض على اليهود — أي الختان.</w:t>
+        <w:t>كان الختان يَتعلَّق بتحقيق وعد الله بخصوص نَسل إبراهيم (</w:t>
+      </w:r>
+      <w:r>
+        <w:rPr>
+          <w:rtl/>
+          <w:cs/>
+          <w:lang w:val="ar_AE" w:bidi="ar_AE"/>
+        </w:rPr>
+        <w:t>تكوين 17 : 9–12</w:t>
+      </w:r>
+      <w:r>
+        <w:rPr>
+          <w:rtl/>
+          <w:cs/>
+          <w:lang w:val="ar_AE" w:bidi="ar_AE"/>
+        </w:rPr>
+        <w:t>). نظرًا لأن الطقس يتم في العضو التناسلي، كانت العلامة تَتعلَّق بنمو ذلك النَسل. إن القيام به على الرضيع البالغ من العمر ثماني أيام يُبرهن الطبيعة المُنعمة لوعد الله لنَسل إبراهيم، ويُشير إلى أن شعب الله يحتاجون إلى النعمة المُطهرة منذ الولادة (</w:t>
+      </w:r>
+      <w:r>
+        <w:rPr>
+          <w:rtl/>
+          <w:cs/>
+          <w:lang w:val="ar_AE" w:bidi="ar_AE"/>
+        </w:rPr>
+        <w:t>لاويين 12: 1–3</w:t>
+      </w:r>
+      <w:r>
+        <w:rPr>
+          <w:rtl/>
+          <w:cs/>
+          <w:lang w:val="ar_AE" w:bidi="ar_AE"/>
+        </w:rPr>
+        <w:t>). كانت وعود العهد تُؤكَّد مجدَّدًا لكل جيلٍ قبل أن يَستطيع مُستقبِلي الختان أن يَتجاوبوا إما بالإيمان أو بعدم الإيمان. لا يوجد في قلوب الشعب المُختار ما يمكنه أن يُؤثِّر على التحقيق النهائي للوعود التي أُعطيت لإبراهيم ونسله.</w:t>
+      </w:r>
+    </w:p>
+    <w:p>
+      <w:pPr>
+        <w:bidi/>
+      </w:pPr>
+      <w:r>
+        <w:rPr>
+          <w:rtl/>
+          <w:cs/>
+          <w:lang w:val="ar_AE" w:bidi="ar_AE"/>
+        </w:rPr>
+      </w:r>
+      <w:r>
+        <w:rPr>
+          <w:rtl/>
+          <w:cs/>
+          <w:lang w:val="ar_AE" w:bidi="ar_AE"/>
+        </w:rPr>
+        <w:t>كان الختان يَتعلَّق أيضًا بتحقيق وعد الله بخصوص الأرض (</w:t>
+      </w:r>
+      <w:r>
+        <w:rPr>
+          <w:rtl/>
+          <w:cs/>
+          <w:lang w:val="ar_AE" w:bidi="ar_AE"/>
+        </w:rPr>
+        <w:t>تكوين 17 : 9</w:t>
+      </w:r>
+      <w:r>
+        <w:rPr>
+          <w:rtl/>
+          <w:cs/>
+          <w:lang w:val="ar_AE" w:bidi="ar_AE"/>
+        </w:rPr>
+        <w:t>). كانت الأرض مِلكيَّة مُقدَّسة لله، وكان يجب أن يكون شعب إسرائيل مُقدَّسين ليمتلكوها. عندما كان يوسف ونسله في مصر، استمروا في ختان أبنائهم. لكن بعد الخطية الكبيرة عند جبل سيناء بعد الخروج، فشلَ شعب إسرائيل غير المؤمن في وضع علامة العهد على أولادهم بينما كانوا يدورون في البرية. ولأن الجيل الجديد لم يكن قد تم ختانه، كان الشعب غير مُستعدٍ لأن يَدخل أرض الموعد. لذلك، أمرَ اللهُ يشوع بأن يَختن رجال إسرائيل. كان التجاوب المُطيع للشعب فعلَ إيمانٍ، لأن جيوش العدو كانت مُخيِّمة بالقرب منهم بينما كان مُحاربو إسرائيل مُقعدين يتعافون من العمليَّة الجراحيَّة (</w:t>
+      </w:r>
+      <w:r>
+        <w:rPr>
+          <w:rtl/>
+          <w:cs/>
+          <w:lang w:val="ar_AE" w:bidi="ar_AE"/>
+        </w:rPr>
+        <w:t>يشوع 5: 2–9</w:t>
+      </w:r>
+      <w:r>
+        <w:rPr>
+          <w:rtl/>
+          <w:cs/>
+          <w:lang w:val="ar_AE" w:bidi="ar_AE"/>
+        </w:rPr>
+        <w:t>).</w:t>
+      </w:r>
+    </w:p>
+    <w:p>
+      <w:pPr>
+        <w:bidi/>
+      </w:pPr>
+      <w:r>
+        <w:rPr>
+          <w:rtl/>
+          <w:cs/>
+          <w:lang w:val="ar_AE" w:bidi="ar_AE"/>
+        </w:rPr>
+      </w:r>
+      <w:r>
+        <w:rPr>
+          <w:rtl/>
+          <w:cs/>
+          <w:lang w:val="ar_AE" w:bidi="ar_AE"/>
+        </w:rPr>
+        <w:t>منذ البداية، كان الاشتراك في وعود العهد مُتاحة لأشخاص من خارج بيت إبراهيم (</w:t>
+      </w:r>
+      <w:r>
+        <w:rPr>
+          <w:rtl/>
+          <w:cs/>
+          <w:lang w:val="ar_AE" w:bidi="ar_AE"/>
+        </w:rPr>
+        <w:t>تكوين 17: 12، 13</w:t>
+      </w:r>
+      <w:r>
+        <w:rPr>
+          <w:rtl/>
+          <w:cs/>
+          <w:lang w:val="ar_AE" w:bidi="ar_AE"/>
+        </w:rPr>
+        <w:t xml:space="preserve">). يُعطي نَصُّ </w:t>
+      </w:r>
+      <w:r>
+        <w:rPr>
+          <w:rtl/>
+          <w:cs/>
+          <w:lang w:val="ar_AE" w:bidi="ar_AE"/>
+        </w:rPr>
+        <w:t>خروج 12: 43–49</w:t>
+      </w:r>
+      <w:r>
+        <w:rPr>
+          <w:rtl/>
+          <w:cs/>
+          <w:lang w:val="ar_AE" w:bidi="ar_AE"/>
+        </w:rPr>
+        <w:t xml:space="preserve"> غير الإسرائيليين الفرصةَ للاشتراك في الفِصح إذا كانوا راغبين في إتمام نفس الشرط المفروض على اليهود — أي الختان.</w:t>
       </w:r>
     </w:p>
     <w:p>
@@ -20090,227 +20794,1203 @@
           <w:cs/>
           <w:lang w:val="ar_AE" w:bidi="ar_AE"/>
         </w:rPr>
-        <w:t>كان يوحنا المعمدان مختونًا، وكذلك يسوع وبولس (لوقا 1: 59؛ 2: 21؛ فيلبي 3: 5). أدركَ يسوع الأهميَّة التطهيريَّة للختان (يوحنا 7: 22، 23)، إذ قارنَ بين هذا الطقس وبين خدمة الشفاء التي قام بها وجعلتْ إنسانًا ما صحيحًا تمامًا، وبالتالي سيُعتبر "طاهرًا" طقسيًا. قبل أن يُرجم مباشرةً، أشار اسطفانوس إلى عهد الختان وألقى باللوم على اليهود الذين يَتهمونه، مثل أسلافهم، بأنهم قُساة الرقاب وغير المختونين بالقلوب والآذان، وبأنهم يقاومون الروح القدس دائمًا (أعمال الرسل 7: 8، 51).</w:t>
-      </w:r>
-    </w:p>
-    <w:p>
-      <w:pPr>
-        <w:bidi/>
-      </w:pPr>
-      <w:r>
-        <w:rPr>
-          <w:rtl/>
-          <w:cs/>
-          <w:lang w:val="ar_AE" w:bidi="ar_AE"/>
-        </w:rPr>
-      </w:r>
-      <w:r>
-        <w:rPr>
-          <w:rtl/>
-          <w:cs/>
-          <w:lang w:val="ar_AE" w:bidi="ar_AE"/>
-        </w:rPr>
-        <w:t>لفترة من الوقت، استمرَ المسيحيون الأوائل في الاشتراك في الطقوس والعادات اليهوديَّة، حتى أنهم كانوا يحضرون طقوس العبادة في الهيكل (أعمال الرسل 3: 1؛ 5: 21، 42). عندما جاء الأمم إلى المسيح، نشأَ جدالٌ بين الذين قالوا إن الاشتراك في جماعة العهد يَتطلَّب الختان والذين رأوا أن هذا الطقس غير ضروري. قيل إنه بما أن وعد العهد بخصوص المسيا أُعطيَ لليهود، فلا بد أن يَختتن الأمم أولًا ويصبحوا يهودًا قبل أن ينالوا الخلاص في المسيح.</w:t>
-      </w:r>
-    </w:p>
-    <w:p>
-      <w:pPr>
-        <w:bidi/>
-      </w:pPr>
-      <w:r>
-        <w:rPr>
-          <w:rtl/>
-          <w:cs/>
-          <w:lang w:val="ar_AE" w:bidi="ar_AE"/>
-        </w:rPr>
-      </w:r>
-      <w:r>
-        <w:rPr>
-          <w:rtl/>
-          <w:cs/>
-          <w:lang w:val="ar_AE" w:bidi="ar_AE"/>
-        </w:rPr>
-        <w:t>في زمن المسيح، أساء بعض اليهود فهم معنى الختان. فقد اعتقدوا أن الختان الجسدي ضروري للخلاص وأنه يضمنه. وهكذا لم يعد هذا الطقس، بالنسبة إلى بعضهم، مجرد علامة على الانتماء إلى جماعة العهد، بل أصبح أيضًا أساسًا لثقتهم بمكانتهم أمام الله (فيلبي 3: 4–6). ربطَ هؤلاء اليهود طقس الختان بالناموس الموسوي بدلًا من وعد الله لإبراهيم (يوحنا 7: 22؛ أعمال الرسل 15: 1). ولأن اليونانيين والرومان لم يمارسوا الختان، أصبح اليهود يُدعَون "الختان" (أعمال الرسل 10: 45؛ 11: 2؛ رومية 15: 8؛ غلاطية 2: 7–9؛ أفسس 2: 11؛ تيطس 1: 10)، وباتباع نَهج العهد القديم (حزقيال 28: 10؛ 31: 18؛ 32: 19–32)، كان يُطلق على الأمم "الغُرلة" (غلاطية 2: 7؛ أفسس 2: 11).</w:t>
-      </w:r>
-    </w:p>
-    <w:p>
-      <w:pPr>
-        <w:bidi/>
-      </w:pPr>
-      <w:r>
-        <w:rPr>
-          <w:rtl/>
-          <w:cs/>
-          <w:lang w:val="ar_AE" w:bidi="ar_AE"/>
-        </w:rPr>
-      </w:r>
-      <w:r>
-        <w:rPr>
-          <w:rtl/>
-          <w:cs/>
-          <w:lang w:val="ar_AE" w:bidi="ar_AE"/>
-        </w:rPr>
-        <w:t>أثناء زيارتهم لقيصريَّة، اندهشَ المؤمنون اليهود عند معرفة أن الأمم غير المختونين نالوا عطية الروح القُدُس المُطهِّرة (أعمال الرسل 10: 44–48). كان موسى قد وعد بأن الله سيَختن قلوبَ شعبه لكي يَحبوا الرب بالقلب والنفس (تثنية 30: 6). كان حزقيال قد تنبأَ بأن الرَّبَّ سيَرُشُّ على شعبه ماءً طاهرًا، مُعطيًا إياهم قلبًا جديدًا وواضعًا روحه في داخلهم (حزقيال 36: 25–27). عندما شهدَ هؤلاء المؤمنون اليهود تحقيق النبوءة القائلة بأن الله سيَسكُب روحه على كل بشر (يوئيل 2: 28؛ أعمال الرسل 2: 17)، أدركوا أن الحقيقة الداخليَّة التي يَرمُز إليها الختان يُمكن أن تتحقق بدون العلامة الجسديَّة. لذلك، تم تعميد أولئك المؤمنين من الأمم على الفور.</w:t>
-      </w:r>
-    </w:p>
-    <w:p>
-      <w:pPr>
-        <w:bidi/>
-      </w:pPr>
-      <w:r>
-        <w:rPr>
-          <w:rtl/>
-          <w:cs/>
-          <w:lang w:val="ar_AE" w:bidi="ar_AE"/>
-        </w:rPr>
-      </w:r>
-      <w:r>
-        <w:rPr>
-          <w:rtl/>
-          <w:cs/>
-          <w:lang w:val="ar_AE" w:bidi="ar_AE"/>
-        </w:rPr>
-        <w:t>لم يكن كل المؤمنين اليهود مستعدين على الفور أن يَقبلوا انضمام الأمم إلى الكنيسة. عندما عاد بطرس إلى أورشليم بعد زيارته لقيصريَّة، انتقده الذين من "أهل الختان." لكن بعد أن أخبرهم بطرسُ كيف حلَّ الروح القُدُس على الأمم، أعلنَ أنه لم يستطِع الوقوف ضد الله. فلما سمع المؤمنون اليهود ذلك سكتوا، وكانوا يُمجدون الله من أجل أن التوبةَ للحياة مُنحتْ للأمم (أعمال الرسل 11: 1–3، 15: 8).</w:t>
-      </w:r>
-    </w:p>
-    <w:p>
-      <w:pPr>
-        <w:bidi/>
-      </w:pPr>
-      <w:r>
-        <w:rPr>
-          <w:rtl/>
-          <w:cs/>
-          <w:lang w:val="ar_AE" w:bidi="ar_AE"/>
-        </w:rPr>
-      </w:r>
-      <w:r>
-        <w:rPr>
-          <w:rtl/>
-          <w:cs/>
-          <w:lang w:val="ar_AE" w:bidi="ar_AE"/>
-        </w:rPr>
-        <w:t>قام بعض "المُهوِّدين" من جماعة الفريسيين بتعليم المسيحيين في أنطاكية بأن الختان كان ضروريًا للخلاص (أعمال الرسل 15: 1، 5). بعد مناقشة هؤلاء الأشخاص، ذهبَ بولس وبرنابا إلى أورشليم للتشاور مع الرُسل الآخرين والشيوخ (آية 2). جادلَ بطرس بأن الله قد أعطى الروح القُدُس للأمم وأنه "طهَّر بالإيمان قلوبهم،" مؤكِّدًا على أننا "بِنِعْمَةِ الرَّبِّ يَسُوعَ الْمَسِيحِ نُؤْمِنُ أَنْ نَخْلُصَ كَمَا أُولئِكَ أَيْضًا" (آية 8، 9، 11). لذلك، اتفقَ يعقوب وغيره من قادة أورشليم على أنه لا ينبغي فرض الختان على الأمم (آية 13–21).</w:t>
-      </w:r>
-    </w:p>
-    <w:p>
-      <w:pPr>
-        <w:bidi/>
-      </w:pPr>
-      <w:r>
-        <w:rPr>
-          <w:rtl/>
-          <w:cs/>
-          <w:lang w:val="ar_AE" w:bidi="ar_AE"/>
-        </w:rPr>
-      </w:r>
-      <w:r>
-        <w:rPr>
-          <w:rtl/>
-          <w:cs/>
-          <w:lang w:val="ar_AE" w:bidi="ar_AE"/>
-        </w:rPr>
-        <w:t>تَقررَ أن يُؤتَمَن بطرس ويعقوب ويوحنا على الإنجيل إلى "المختونين،" في حين أن بولس وبرنابا سيَكرِزان إلى "غير المختونين" (غلاطية 2: 7–9). بسبب خطته الكِرازيَّة بأن يكون "للكلِّ كلَّ شيءٍ" فيما يَتعلَّق بالعادات التي لا تَفرق روحيًا (1 كورنثوس 9: 19–23)، جعلَ بولسُ تيموثاوس يَختتن. كان اليهود يعتبرون تيموثاوس من عِرقهم لأن أمه كانت يهوديَّة ( أعمال الرسل 16: 1، 2). لكن بولس قاوم المحاولات لِجعل تيطس يَختتن، لأنه كان أُمميًا (غلاطية 2: 3). من الواضح أن بولس سمحَ للمؤمنين اليهود بأن يَختنوا أبناءهم (أعمال الرسل 21: 21).</w:t>
-      </w:r>
-    </w:p>
-    <w:p>
-      <w:pPr>
-        <w:bidi/>
-      </w:pPr>
-      <w:r>
-        <w:rPr>
-          <w:rtl/>
-          <w:cs/>
-          <w:lang w:val="ar_AE" w:bidi="ar_AE"/>
-        </w:rPr>
-      </w:r>
-      <w:r>
-        <w:rPr>
-          <w:rtl/>
-          <w:cs/>
-          <w:lang w:val="ar_AE" w:bidi="ar_AE"/>
-        </w:rPr>
-        <w:t>مع ذلك، انتقدَ بولسُ الذين جادلوا بأنه يجب أن يَختتن المؤمنون الغلاطيون وأن يحفظوا الناموس بأنهم أنفسهم لم يحفظوا الناموس بل أرادوا أن يتفاخروا في جسد الغلاطيين وأن يتجنبوا الاضطهاد من أجل صليب المسيح (غلاطية 6: 12، 13) — الاضطهاد الذي كان بولس مستعداً لتحمله (5: 11). على سبيل الجدال، اعترفَ بالافتراض الفريسي بأن الخلاص يمكن أن يَتحقق من خلال حِفظ الناموس، أعلنَ بولس أن الذين اختتنوا يجب أن يطيعوا كل الناموس (5: 2، 3). لن "يَنفعَ المسيحُ" أولئك الذين "يَتبررون بالناموس"؛ إن هذه المحاولة للتبرير بالأعمال ستُثبتْ أن الغلاطيين "انقطعوا عن المسيح،" إذ أنهم "سقطوا من النعمة" (آية 2–4). كان هؤلاء المسيحيون يتعرضون للإغراء بأن يَتجهوا نحو "إنجيلٍ آخر" (1: 6، 7).</w:t>
-      </w:r>
-    </w:p>
-    <w:p>
-      <w:pPr>
-        <w:bidi/>
-      </w:pPr>
-      <w:r>
-        <w:rPr>
-          <w:rtl/>
-          <w:cs/>
-          <w:lang w:val="ar_AE" w:bidi="ar_AE"/>
-        </w:rPr>
-      </w:r>
-      <w:r>
-        <w:rPr>
-          <w:rtl/>
-          <w:cs/>
-          <w:lang w:val="ar_AE" w:bidi="ar_AE"/>
-        </w:rPr>
-        <w:t>بسبب التهديد الخطير الذي شكَّله المُهوِّدون لإنجيل النعمة المجانيَّة، تمَّنى بولسُ أن الذين يُقلقون الغلاطيين "يَقطعوا" أنفسهم (غلاطية 5: 12). أطلقَ على المُهوِّدين تعبير "الكلاب" و"فَعلة الشر،" مؤكدًا على أن المسيحيين هم "الختان الحقيقي،" لأنهم يعبدون الله بالروح، ويفتخرون في المسيح يسوع، ولا يَتكلون على الأعمال البشريَّة لينالوا الخلاص عن استحقاق (فيلبي 3: 2، 3).</w:t>
-      </w:r>
-    </w:p>
-    <w:p>
-      <w:pPr>
-        <w:bidi/>
-      </w:pPr>
-      <w:r>
-        <w:rPr>
-          <w:rtl/>
-          <w:cs/>
-          <w:lang w:val="ar_AE" w:bidi="ar_AE"/>
-        </w:rPr>
-      </w:r>
-      <w:r>
-        <w:rPr>
-          <w:rtl/>
-          <w:cs/>
-          <w:lang w:val="ar_AE" w:bidi="ar_AE"/>
-        </w:rPr>
-        <w:t>علِّم بولسُ بأن الختان كان بالتأكيد ذا قيمةٍ لليهود، لأنه كان العلامة على أنهم استؤمنوا على "أقوال الله،" أي كلمة الله المُتعلِّقة بوعد الخلاص (رومية 3: 1–3). قام بتذكير أهل أفسس المُفتخرين بأنهم باعتبارهم أمميين كانوا ذات يوم "غرباء عن عهود الموعد،" ولم يَحملوا علامة العهد في أجسادهم (أفسس 2: 11، 12؛ انظر كولوسي 2: 13). بالمثل، لم يكن لدى اليهود سببًا للكبرياء، لأن العصيان يستطيع أن يَجعل الختان الخارجي يُحسَب غُرلةً (رومية 2: 25).</w:t>
-      </w:r>
-    </w:p>
-    <w:p>
-      <w:pPr>
-        <w:bidi/>
-      </w:pPr>
-      <w:r>
-        <w:rPr>
-          <w:rtl/>
-          <w:cs/>
-          <w:lang w:val="ar_AE" w:bidi="ar_AE"/>
-        </w:rPr>
-      </w:r>
-      <w:r>
-        <w:rPr>
-          <w:rtl/>
-          <w:cs/>
-          <w:lang w:val="ar_AE" w:bidi="ar_AE"/>
-        </w:rPr>
-        <w:t>اتبعَ بولسُ والرُسل الآخرون موسى وأنبياء العهد القديم في تعليمهم أن الختان الحقيقي كان مسألةً قلبيَّة. يذهب تعليمُ العهد الجديد إلى أبعد من ذلك حيث يؤكِّد على أن المؤمن الأمين، وإن كان غير مختون جسديًا، يَعتبره اللهُ مختونًا، "لأَنَّ الْيَهُودِيَّ فِي الظَّاهِرِ لَيْسَ هُوَ يَهُودِيًا وَلاَ الْخِتَانُ الَّذِي فِي الظَّاهِرِ فِي اللَّحْمِ خِتَانًا" (رومية 2: 28). يَخلُص اليهود والأمم بالنعمة (أعمال الرسل 15: 11)، ويَتبرَّر المختونون وغير المختونين على حد سواء على أساس إيمانهم، بمعزل عن أعمال الناموس (رومية 3: 28–30).</w:t>
-      </w:r>
-    </w:p>
-    <w:p>
-      <w:pPr>
-        <w:bidi/>
-      </w:pPr>
-      <w:r>
-        <w:rPr>
-          <w:rtl/>
-          <w:cs/>
-          <w:lang w:val="ar_AE" w:bidi="ar_AE"/>
-        </w:rPr>
-      </w:r>
-      <w:r>
-        <w:rPr>
-          <w:rtl/>
-          <w:cs/>
-          <w:lang w:val="ar_AE" w:bidi="ar_AE"/>
-        </w:rPr>
-        <w:t>كان إبراهيم مثالًا لشخص حُسب له إيمانه برًا (رومية 4: 3؛ انظر تكوين 15: 6). جادلَ بولسُ بأن كلاً من الأمم واليهود يَتبرَّرون بالإيمان، لأن إبراهيم حُسب بارًا قبل أن يُختَن. لم يَختتن إبراهيم للحصول على البِر، بل باعتبار الختان علامةً أو ختمًا للبِر الذي ناله بالإيمان وهو لا يزال غير مختون. لذلك يُعد إبراهيم أبًا لكل الذين يؤمنون وهم غير مختونين، وللمختونين ولكنهم يتبعون أيضًا مِثال إيمان إبراهيم (رومية 4: 9–12؛ انظر غلاطية 3: 6–9).</w:t>
+        <w:t xml:space="preserve">كان يوحنا المعمدان مختونًا، وكذلك يسوع وبولس ( </w:t>
+      </w:r>
+      <w:r>
+        <w:rPr>
+          <w:rtl/>
+          <w:cs/>
+          <w:lang w:val="ar_AE" w:bidi="ar_AE"/>
+        </w:rPr>
+        <w:t>لوقا 1: 59</w:t>
+      </w:r>
+      <w:r>
+        <w:rPr>
+          <w:rtl/>
+          <w:cs/>
+          <w:lang w:val="ar_AE" w:bidi="ar_AE"/>
+        </w:rPr>
+        <w:t xml:space="preserve">؛ </w:t>
+      </w:r>
+      <w:r>
+        <w:rPr>
+          <w:rtl/>
+          <w:cs/>
+          <w:lang w:val="ar_AE" w:bidi="ar_AE"/>
+        </w:rPr>
+        <w:t>2: 21</w:t>
+      </w:r>
+      <w:r>
+        <w:rPr>
+          <w:rtl/>
+          <w:cs/>
+          <w:lang w:val="ar_AE" w:bidi="ar_AE"/>
+        </w:rPr>
+        <w:t xml:space="preserve">؛ </w:t>
+      </w:r>
+      <w:r>
+        <w:rPr>
+          <w:rtl/>
+          <w:cs/>
+          <w:lang w:val="ar_AE" w:bidi="ar_AE"/>
+        </w:rPr>
+        <w:t>فيلبي 3: 5</w:t>
+      </w:r>
+      <w:r>
+        <w:rPr>
+          <w:rtl/>
+          <w:cs/>
+          <w:lang w:val="ar_AE" w:bidi="ar_AE"/>
+        </w:rPr>
+        <w:t>). أدركَ يسوع الأهميَّة التطهيريَّة للختان (</w:t>
+      </w:r>
+      <w:r>
+        <w:rPr>
+          <w:rtl/>
+          <w:cs/>
+          <w:lang w:val="ar_AE" w:bidi="ar_AE"/>
+        </w:rPr>
+        <w:t>يوحنا 7: 22، 23</w:t>
+      </w:r>
+      <w:r>
+        <w:rPr>
+          <w:rtl/>
+          <w:cs/>
+          <w:lang w:val="ar_AE" w:bidi="ar_AE"/>
+        </w:rPr>
+        <w:t>)، إذ قارنَ بين هذا الطقس وبين خدمة الشفاء التي قام بها وجعلتْ إنسانًا ما صحيحًا تمامًا، وبالتالي سيُعتبر "طاهرًا" طقسيًا. قبل أن يُرجم مباشرةً، أشار اسطفانوس إلى عهد الختان وألقى باللوم على اليهود الذين يَتهمونه، مثل أسلافهم، بأنهم قُساة الرقاب وغير المختونين بالقلوب والآذان، وبأنهم يقاومون الروح القدس دائمًا (</w:t>
+      </w:r>
+      <w:r>
+        <w:rPr>
+          <w:rtl/>
+          <w:cs/>
+          <w:lang w:val="ar_AE" w:bidi="ar_AE"/>
+        </w:rPr>
+        <w:t>أعمال الرسل 7: 8</w:t>
+      </w:r>
+      <w:r>
+        <w:rPr>
+          <w:rtl/>
+          <w:cs/>
+          <w:lang w:val="ar_AE" w:bidi="ar_AE"/>
+        </w:rPr>
+        <w:t xml:space="preserve">، </w:t>
+      </w:r>
+      <w:r>
+        <w:rPr>
+          <w:rtl/>
+          <w:cs/>
+          <w:lang w:val="ar_AE" w:bidi="ar_AE"/>
+        </w:rPr>
+        <w:t>51</w:t>
+      </w:r>
+      <w:r>
+        <w:rPr>
+          <w:rtl/>
+          <w:cs/>
+          <w:lang w:val="ar_AE" w:bidi="ar_AE"/>
+        </w:rPr>
+        <w:t>).</w:t>
+      </w:r>
+    </w:p>
+    <w:p>
+      <w:pPr>
+        <w:bidi/>
+      </w:pPr>
+      <w:r>
+        <w:rPr>
+          <w:rtl/>
+          <w:cs/>
+          <w:lang w:val="ar_AE" w:bidi="ar_AE"/>
+        </w:rPr>
+      </w:r>
+      <w:r>
+        <w:rPr>
+          <w:rtl/>
+          <w:cs/>
+          <w:lang w:val="ar_AE" w:bidi="ar_AE"/>
+        </w:rPr>
+        <w:t>لفترة من الوقت، استمرَ المسيحيون الأوائل في الاشتراك في الطقوس والعادات اليهوديَّة، حتى أنهم كانوا يحضرون طقوس العبادة في الهيكل (</w:t>
+      </w:r>
+      <w:r>
+        <w:rPr>
+          <w:rtl/>
+          <w:cs/>
+          <w:lang w:val="ar_AE" w:bidi="ar_AE"/>
+        </w:rPr>
+        <w:t>أعمال الرسل 3: 1</w:t>
+      </w:r>
+      <w:r>
+        <w:rPr>
+          <w:rtl/>
+          <w:cs/>
+          <w:lang w:val="ar_AE" w:bidi="ar_AE"/>
+        </w:rPr>
+        <w:t xml:space="preserve">؛ </w:t>
+      </w:r>
+      <w:r>
+        <w:rPr>
+          <w:rtl/>
+          <w:cs/>
+          <w:lang w:val="ar_AE" w:bidi="ar_AE"/>
+        </w:rPr>
+        <w:t>5: 21</w:t>
+      </w:r>
+      <w:r>
+        <w:rPr>
+          <w:rtl/>
+          <w:cs/>
+          <w:lang w:val="ar_AE" w:bidi="ar_AE"/>
+        </w:rPr>
+        <w:t>،</w:t>
+      </w:r>
+      <w:r>
+        <w:rPr>
+          <w:rtl/>
+          <w:cs/>
+          <w:lang w:val="ar_AE" w:bidi="ar_AE"/>
+        </w:rPr>
+        <w:t xml:space="preserve"> </w:t>
+      </w:r>
+      <w:r>
+        <w:rPr>
+          <w:rtl/>
+          <w:cs/>
+          <w:lang w:val="ar_AE" w:bidi="ar_AE"/>
+        </w:rPr>
+        <w:t>42</w:t>
+      </w:r>
+      <w:r>
+        <w:rPr>
+          <w:rtl/>
+          <w:cs/>
+          <w:lang w:val="ar_AE" w:bidi="ar_AE"/>
+        </w:rPr>
+        <w:t>). عندما جاء الأمم إلى المسيح، نشأَ جدالٌ بين الذين قالوا إن الاشتراك في جماعة العهد يَتطلَّب الختان والذين رأوا أن هذا الطقس غير ضروري. قيل إنه بما أن وعد العهد بخصوص المسيا أُعطيَ لليهود، فلا بد أن يَختتن الأمم أولًا ويصبحوا يهودًا قبل أن ينالوا الخلاص في المسيح.</w:t>
+      </w:r>
+    </w:p>
+    <w:p>
+      <w:pPr>
+        <w:bidi/>
+      </w:pPr>
+      <w:r>
+        <w:rPr>
+          <w:rtl/>
+          <w:cs/>
+          <w:lang w:val="ar_AE" w:bidi="ar_AE"/>
+        </w:rPr>
+      </w:r>
+      <w:r>
+        <w:rPr>
+          <w:rtl/>
+          <w:cs/>
+          <w:lang w:val="ar_AE" w:bidi="ar_AE"/>
+        </w:rPr>
+        <w:t>في زمن المسيح، أساء بعض اليهود فهم معنى الختان. فقد اعتقدوا أن الختان الجسدي ضروري للخلاص وأنه يضمنه. وهكذا لم يعد هذا الطقس، بالنسبة إلى بعضهم، مجرد علامة على الانتماء إلى جماعة العهد، بل أصبح أيضًا أساسًا لثقتهم بمكانتهم أمام الله (</w:t>
+      </w:r>
+      <w:r>
+        <w:rPr>
+          <w:rtl/>
+          <w:cs/>
+          <w:lang w:val="ar_AE" w:bidi="ar_AE"/>
+        </w:rPr>
+        <w:t>فيلبي 3: 4–6</w:t>
+      </w:r>
+      <w:r>
+        <w:rPr>
+          <w:rtl/>
+          <w:cs/>
+          <w:lang w:val="ar_AE" w:bidi="ar_AE"/>
+        </w:rPr>
+        <w:t>). ربطَ هؤلاء اليهود طقس الختان بالناموس الموسوي بدلًا من وعد الله لإبراهيم (</w:t>
+      </w:r>
+      <w:r>
+        <w:rPr>
+          <w:rtl/>
+          <w:cs/>
+          <w:lang w:val="ar_AE" w:bidi="ar_AE"/>
+        </w:rPr>
+        <w:t>يوحنا 7: 22</w:t>
+      </w:r>
+      <w:r>
+        <w:rPr>
+          <w:rtl/>
+          <w:cs/>
+          <w:lang w:val="ar_AE" w:bidi="ar_AE"/>
+        </w:rPr>
+        <w:t xml:space="preserve">؛ </w:t>
+      </w:r>
+      <w:r>
+        <w:rPr>
+          <w:rtl/>
+          <w:cs/>
+          <w:lang w:val="ar_AE" w:bidi="ar_AE"/>
+        </w:rPr>
+        <w:t>أعمال الرسل 15: 1</w:t>
+      </w:r>
+      <w:r>
+        <w:rPr>
+          <w:rtl/>
+          <w:cs/>
+          <w:lang w:val="ar_AE" w:bidi="ar_AE"/>
+        </w:rPr>
+        <w:t>). ولأن اليونانيين والرومان لم يمارسوا الختان، أصبح اليهود يُدعَون "الختان" (</w:t>
+      </w:r>
+      <w:r>
+        <w:rPr>
+          <w:rtl/>
+          <w:cs/>
+          <w:lang w:val="ar_AE" w:bidi="ar_AE"/>
+        </w:rPr>
+        <w:t>أعمال الرسل 10: 45</w:t>
+      </w:r>
+      <w:r>
+        <w:rPr>
+          <w:rtl/>
+          <w:cs/>
+          <w:lang w:val="ar_AE" w:bidi="ar_AE"/>
+        </w:rPr>
+        <w:t xml:space="preserve">؛ </w:t>
+      </w:r>
+      <w:r>
+        <w:rPr>
+          <w:rtl/>
+          <w:cs/>
+          <w:lang w:val="ar_AE" w:bidi="ar_AE"/>
+        </w:rPr>
+        <w:t>11: 2</w:t>
+      </w:r>
+      <w:r>
+        <w:rPr>
+          <w:rtl/>
+          <w:cs/>
+          <w:lang w:val="ar_AE" w:bidi="ar_AE"/>
+        </w:rPr>
+        <w:t xml:space="preserve">؛ </w:t>
+      </w:r>
+      <w:r>
+        <w:rPr>
+          <w:rtl/>
+          <w:cs/>
+          <w:lang w:val="ar_AE" w:bidi="ar_AE"/>
+        </w:rPr>
+        <w:t>رومية 15: 8</w:t>
+      </w:r>
+      <w:r>
+        <w:rPr>
+          <w:rtl/>
+          <w:cs/>
+          <w:lang w:val="ar_AE" w:bidi="ar_AE"/>
+        </w:rPr>
+        <w:t xml:space="preserve">؛ </w:t>
+      </w:r>
+      <w:r>
+        <w:rPr>
+          <w:rtl/>
+          <w:cs/>
+          <w:lang w:val="ar_AE" w:bidi="ar_AE"/>
+        </w:rPr>
+        <w:t>غلاطية 2: 7–9</w:t>
+      </w:r>
+      <w:r>
+        <w:rPr>
+          <w:rtl/>
+          <w:cs/>
+          <w:lang w:val="ar_AE" w:bidi="ar_AE"/>
+        </w:rPr>
+        <w:t xml:space="preserve">؛ </w:t>
+      </w:r>
+      <w:r>
+        <w:rPr>
+          <w:rtl/>
+          <w:cs/>
+          <w:lang w:val="ar_AE" w:bidi="ar_AE"/>
+        </w:rPr>
+        <w:t>أفسس 2: 11</w:t>
+      </w:r>
+      <w:r>
+        <w:rPr>
+          <w:rtl/>
+          <w:cs/>
+          <w:lang w:val="ar_AE" w:bidi="ar_AE"/>
+        </w:rPr>
+        <w:t xml:space="preserve">؛ </w:t>
+      </w:r>
+      <w:r>
+        <w:rPr>
+          <w:rtl/>
+          <w:cs/>
+          <w:lang w:val="ar_AE" w:bidi="ar_AE"/>
+        </w:rPr>
+        <w:t>تيطس 1: 10</w:t>
+      </w:r>
+      <w:r>
+        <w:rPr>
+          <w:rtl/>
+          <w:cs/>
+          <w:lang w:val="ar_AE" w:bidi="ar_AE"/>
+        </w:rPr>
+        <w:t>)، وباتباع نَهج العهد القديم (</w:t>
+      </w:r>
+      <w:r>
+        <w:rPr>
+          <w:rtl/>
+          <w:cs/>
+          <w:lang w:val="ar_AE" w:bidi="ar_AE"/>
+        </w:rPr>
+        <w:t>حزقيال 28: 10</w:t>
+      </w:r>
+      <w:r>
+        <w:rPr>
+          <w:rtl/>
+          <w:cs/>
+          <w:lang w:val="ar_AE" w:bidi="ar_AE"/>
+        </w:rPr>
+        <w:t xml:space="preserve">؛ </w:t>
+      </w:r>
+      <w:r>
+        <w:rPr>
+          <w:rtl/>
+          <w:cs/>
+          <w:lang w:val="ar_AE" w:bidi="ar_AE"/>
+        </w:rPr>
+        <w:t>31: 18</w:t>
+      </w:r>
+      <w:r>
+        <w:rPr>
+          <w:rtl/>
+          <w:cs/>
+          <w:lang w:val="ar_AE" w:bidi="ar_AE"/>
+        </w:rPr>
+        <w:t xml:space="preserve">؛ </w:t>
+      </w:r>
+      <w:r>
+        <w:rPr>
+          <w:rtl/>
+          <w:cs/>
+          <w:lang w:val="ar_AE" w:bidi="ar_AE"/>
+        </w:rPr>
+        <w:t>32: 19–32</w:t>
+      </w:r>
+      <w:r>
+        <w:rPr>
+          <w:rtl/>
+          <w:cs/>
+          <w:lang w:val="ar_AE" w:bidi="ar_AE"/>
+        </w:rPr>
+        <w:t>)، كان يُطلق على الأمم "الغُرلة" (</w:t>
+      </w:r>
+      <w:r>
+        <w:rPr>
+          <w:rtl/>
+          <w:cs/>
+          <w:lang w:val="ar_AE" w:bidi="ar_AE"/>
+        </w:rPr>
+        <w:t>غلاطية 2: 7</w:t>
+      </w:r>
+      <w:r>
+        <w:rPr>
+          <w:rtl/>
+          <w:cs/>
+          <w:lang w:val="ar_AE" w:bidi="ar_AE"/>
+        </w:rPr>
+        <w:t xml:space="preserve">؛ </w:t>
+      </w:r>
+      <w:r>
+        <w:rPr>
+          <w:rtl/>
+          <w:cs/>
+          <w:lang w:val="ar_AE" w:bidi="ar_AE"/>
+        </w:rPr>
+        <w:t>أفسس 2: 11</w:t>
+      </w:r>
+      <w:r>
+        <w:rPr>
+          <w:rtl/>
+          <w:cs/>
+          <w:lang w:val="ar_AE" w:bidi="ar_AE"/>
+        </w:rPr>
+        <w:t>).</w:t>
+      </w:r>
+    </w:p>
+    <w:p>
+      <w:pPr>
+        <w:bidi/>
+      </w:pPr>
+      <w:r>
+        <w:rPr>
+          <w:rtl/>
+          <w:cs/>
+          <w:lang w:val="ar_AE" w:bidi="ar_AE"/>
+        </w:rPr>
+      </w:r>
+      <w:r>
+        <w:rPr>
+          <w:rtl/>
+          <w:cs/>
+          <w:lang w:val="ar_AE" w:bidi="ar_AE"/>
+        </w:rPr>
+        <w:t>أثناء زيارتهم لقيصريَّة، اندهشَ المؤمنون اليهود عند معرفة أن الأمم غير المختونين نالوا عطية الروح القُدُس المُطهِّرة (</w:t>
+      </w:r>
+      <w:r>
+        <w:rPr>
+          <w:rtl/>
+          <w:cs/>
+          <w:lang w:val="ar_AE" w:bidi="ar_AE"/>
+        </w:rPr>
+        <w:t>أعمال الرسل 10: 44–48</w:t>
+      </w:r>
+      <w:r>
+        <w:rPr>
+          <w:rtl/>
+          <w:cs/>
+          <w:lang w:val="ar_AE" w:bidi="ar_AE"/>
+        </w:rPr>
+        <w:t>). كان موسى قد وعد بأن الله سيَختن قلوبَ شعبه لكي يَحبوا الرب بالقلب والنفس (</w:t>
+      </w:r>
+      <w:r>
+        <w:rPr>
+          <w:rtl/>
+          <w:cs/>
+          <w:lang w:val="ar_AE" w:bidi="ar_AE"/>
+        </w:rPr>
+        <w:t>تثنية 30: 6</w:t>
+      </w:r>
+      <w:r>
+        <w:rPr>
+          <w:rtl/>
+          <w:cs/>
+          <w:lang w:val="ar_AE" w:bidi="ar_AE"/>
+        </w:rPr>
+        <w:t>). كان حزقيال قد تنبأَ بأن الرَّبَّ سيَرُشُّ على شعبه ماءً طاهرًا، مُعطيًا إياهم قلبًا جديدًا وواضعًا روحه في داخلهم (</w:t>
+      </w:r>
+      <w:r>
+        <w:rPr>
+          <w:rtl/>
+          <w:cs/>
+          <w:lang w:val="ar_AE" w:bidi="ar_AE"/>
+        </w:rPr>
+        <w:t>حزقيال 36: 25–27</w:t>
+      </w:r>
+      <w:r>
+        <w:rPr>
+          <w:rtl/>
+          <w:cs/>
+          <w:lang w:val="ar_AE" w:bidi="ar_AE"/>
+        </w:rPr>
+        <w:t>). عندما شهدَ هؤلاء المؤمنون اليهود تحقيق النبوءة القائلة بأن الله سيَسكُب روحه على كل بشر (</w:t>
+      </w:r>
+      <w:r>
+        <w:rPr>
+          <w:rtl/>
+          <w:cs/>
+          <w:lang w:val="ar_AE" w:bidi="ar_AE"/>
+        </w:rPr>
+        <w:t>يوئيل 2: 28</w:t>
+      </w:r>
+      <w:r>
+        <w:rPr>
+          <w:rtl/>
+          <w:cs/>
+          <w:lang w:val="ar_AE" w:bidi="ar_AE"/>
+        </w:rPr>
+        <w:t xml:space="preserve">؛ </w:t>
+      </w:r>
+      <w:r>
+        <w:rPr>
+          <w:rtl/>
+          <w:cs/>
+          <w:lang w:val="ar_AE" w:bidi="ar_AE"/>
+        </w:rPr>
+        <w:t>أعمال الرسل 2: 17</w:t>
+      </w:r>
+      <w:r>
+        <w:rPr>
+          <w:rtl/>
+          <w:cs/>
+          <w:lang w:val="ar_AE" w:bidi="ar_AE"/>
+        </w:rPr>
+        <w:t>)، أدركوا أن الحقيقة الداخليَّة التي يَرمُز إليها الختان يُمكن أن تتحقق بدون العلامة الجسديَّة. لذلك، تم تعميد أولئك المؤمنين من الأمم على الفور.</w:t>
+      </w:r>
+    </w:p>
+    <w:p>
+      <w:pPr>
+        <w:bidi/>
+      </w:pPr>
+      <w:r>
+        <w:rPr>
+          <w:rtl/>
+          <w:cs/>
+          <w:lang w:val="ar_AE" w:bidi="ar_AE"/>
+        </w:rPr>
+      </w:r>
+      <w:r>
+        <w:rPr>
+          <w:rtl/>
+          <w:cs/>
+          <w:lang w:val="ar_AE" w:bidi="ar_AE"/>
+        </w:rPr>
+        <w:t>لم يكن كل المؤمنين اليهود مستعدين على الفور أن يَقبلوا انضمام الأمم إلى الكنيسة. عندما عاد بطرس إلى أورشليم بعد زيارته لقيصريَّة، انتقده الذين من "أهل الختان." لكن بعد أن أخبرهم بطرسُ كيف حلَّ الروح القُدُس على الأمم، أعلنَ أنه لم يستطِع الوقوف ضد الله. فلما سمع المؤمنون اليهود ذلك سكتوا، وكانوا يُمجدون الله من أجل أن التوبةَ للحياة مُنحتْ للأمم (</w:t>
+      </w:r>
+      <w:r>
+        <w:rPr>
+          <w:rtl/>
+          <w:cs/>
+          <w:lang w:val="ar_AE" w:bidi="ar_AE"/>
+        </w:rPr>
+        <w:t>أعمال الرسل 11: 1–3</w:t>
+      </w:r>
+      <w:r>
+        <w:rPr>
+          <w:rtl/>
+          <w:cs/>
+          <w:lang w:val="ar_AE" w:bidi="ar_AE"/>
+        </w:rPr>
+        <w:t>،</w:t>
+      </w:r>
+      <w:r>
+        <w:rPr>
+          <w:rtl/>
+          <w:cs/>
+          <w:lang w:val="ar_AE" w:bidi="ar_AE"/>
+        </w:rPr>
+        <w:t xml:space="preserve"> </w:t>
+      </w:r>
+      <w:r>
+        <w:rPr>
+          <w:rtl/>
+          <w:cs/>
+          <w:lang w:val="ar_AE" w:bidi="ar_AE"/>
+        </w:rPr>
+        <w:t>15</w:t>
+      </w:r>
+      <w:r>
+        <w:rPr>
+          <w:rtl/>
+          <w:cs/>
+          <w:lang w:val="ar_AE" w:bidi="ar_AE"/>
+        </w:rPr>
+        <w:t>).</w:t>
+      </w:r>
+    </w:p>
+    <w:p>
+      <w:pPr>
+        <w:bidi/>
+      </w:pPr>
+      <w:r>
+        <w:rPr>
+          <w:rtl/>
+          <w:cs/>
+          <w:lang w:val="ar_AE" w:bidi="ar_AE"/>
+        </w:rPr>
+      </w:r>
+      <w:r>
+        <w:rPr>
+          <w:rtl/>
+          <w:cs/>
+          <w:lang w:val="ar_AE" w:bidi="ar_AE"/>
+        </w:rPr>
+        <w:t>قام بعض "المُهوِّدين" من جماعة الفريسيين بتعليم المسيحيين في أنطاكية بأن الختان كان ضروريًا للخلاص (</w:t>
+      </w:r>
+      <w:r>
+        <w:rPr>
+          <w:rtl/>
+          <w:cs/>
+          <w:lang w:val="ar_AE" w:bidi="ar_AE"/>
+        </w:rPr>
+        <w:t>أعمال الرسل 15: 1،</w:t>
+      </w:r>
+      <w:r>
+        <w:rPr>
+          <w:rtl/>
+          <w:cs/>
+          <w:lang w:val="ar_AE" w:bidi="ar_AE"/>
+        </w:rPr>
+        <w:t xml:space="preserve"> </w:t>
+      </w:r>
+      <w:r>
+        <w:rPr>
+          <w:rtl/>
+          <w:cs/>
+          <w:lang w:val="ar_AE" w:bidi="ar_AE"/>
+        </w:rPr>
+        <w:t>5</w:t>
+      </w:r>
+      <w:r>
+        <w:rPr>
+          <w:rtl/>
+          <w:cs/>
+          <w:lang w:val="ar_AE" w:bidi="ar_AE"/>
+        </w:rPr>
+        <w:t xml:space="preserve">). بعد مناقشة هؤلاء الأشخاص، ذهبَ بولس وبرنابا إلى أورشليم للتشاور مع الرُسل الآخرين والشيوخ (آية </w:t>
+      </w:r>
+      <w:r>
+        <w:rPr>
+          <w:rtl/>
+          <w:cs/>
+          <w:lang w:val="ar_AE" w:bidi="ar_AE"/>
+        </w:rPr>
+        <w:t>2</w:t>
+      </w:r>
+      <w:r>
+        <w:rPr>
+          <w:rtl/>
+          <w:cs/>
+          <w:lang w:val="ar_AE" w:bidi="ar_AE"/>
+        </w:rPr>
+        <w:t xml:space="preserve">). جادلَ بطرس بأن الله قد أعطى الروح القُدُس للأمم وأنه "طهَّر بالإيمان قلوبهم،" مؤكِّدًا على أننا "بِنِعْمَةِ الرَّبِّ يَسُوعَ الْمَسِيحِ نُؤْمِنُ أَنْ نَخْلُصَ كَمَا أُولئِكَ أَيْضًا" (آية </w:t>
+      </w:r>
+      <w:r>
+        <w:rPr>
+          <w:rtl/>
+          <w:cs/>
+          <w:lang w:val="ar_AE" w:bidi="ar_AE"/>
+        </w:rPr>
+        <w:t>8،</w:t>
+      </w:r>
+      <w:r>
+        <w:rPr>
+          <w:rtl/>
+          <w:cs/>
+          <w:lang w:val="ar_AE" w:bidi="ar_AE"/>
+        </w:rPr>
+        <w:t xml:space="preserve"> </w:t>
+      </w:r>
+      <w:r>
+        <w:rPr>
+          <w:rtl/>
+          <w:cs/>
+          <w:lang w:val="ar_AE" w:bidi="ar_AE"/>
+        </w:rPr>
+        <w:t>9،</w:t>
+      </w:r>
+      <w:r>
+        <w:rPr>
+          <w:rtl/>
+          <w:cs/>
+          <w:lang w:val="ar_AE" w:bidi="ar_AE"/>
+        </w:rPr>
+        <w:t xml:space="preserve"> </w:t>
+      </w:r>
+      <w:r>
+        <w:rPr>
+          <w:rtl/>
+          <w:cs/>
+          <w:lang w:val="ar_AE" w:bidi="ar_AE"/>
+        </w:rPr>
+        <w:t>11</w:t>
+      </w:r>
+      <w:r>
+        <w:rPr>
+          <w:rtl/>
+          <w:cs/>
+          <w:lang w:val="ar_AE" w:bidi="ar_AE"/>
+        </w:rPr>
+        <w:t xml:space="preserve">). لذلك، اتفقَ يعقوب وغيره من قادة أورشليم على أنه لا ينبغي فرض الختان على الأمم (آية </w:t>
+      </w:r>
+      <w:r>
+        <w:rPr>
+          <w:rtl/>
+          <w:cs/>
+          <w:lang w:val="ar_AE" w:bidi="ar_AE"/>
+        </w:rPr>
+        <w:t>13–21</w:t>
+      </w:r>
+      <w:r>
+        <w:rPr>
+          <w:rtl/>
+          <w:cs/>
+          <w:lang w:val="ar_AE" w:bidi="ar_AE"/>
+        </w:rPr>
+        <w:t>).</w:t>
+      </w:r>
+    </w:p>
+    <w:p>
+      <w:pPr>
+        <w:bidi/>
+      </w:pPr>
+      <w:r>
+        <w:rPr>
+          <w:rtl/>
+          <w:cs/>
+          <w:lang w:val="ar_AE" w:bidi="ar_AE"/>
+        </w:rPr>
+      </w:r>
+      <w:r>
+        <w:rPr>
+          <w:rtl/>
+          <w:cs/>
+          <w:lang w:val="ar_AE" w:bidi="ar_AE"/>
+        </w:rPr>
+        <w:t>تَقررَ أن يُؤتَمَن بطرس ويعقوب ويوحنا على الإنجيل إلى "المختونين،" في حين أن بولس وبرنابا سيَكرِزان إلى "غير المختونين" (</w:t>
+      </w:r>
+      <w:r>
+        <w:rPr>
+          <w:rtl/>
+          <w:cs/>
+          <w:lang w:val="ar_AE" w:bidi="ar_AE"/>
+        </w:rPr>
+        <w:t>غلاطية 2: 7–9</w:t>
+      </w:r>
+      <w:r>
+        <w:rPr>
+          <w:rtl/>
+          <w:cs/>
+          <w:lang w:val="ar_AE" w:bidi="ar_AE"/>
+        </w:rPr>
+        <w:t>). بسبب خطته الكِرازيَّة بأن يكون "للكلِّ كلَّ شيءٍ" فيما يَتعلَّق بالعادات التي لا تَفرق روحيًا (</w:t>
+      </w:r>
+      <w:r>
+        <w:rPr>
+          <w:rtl/>
+          <w:cs/>
+          <w:lang w:val="ar_AE" w:bidi="ar_AE"/>
+        </w:rPr>
+        <w:t>1 كورنثوس 9: 19–23</w:t>
+      </w:r>
+      <w:r>
+        <w:rPr>
+          <w:rtl/>
+          <w:cs/>
+          <w:lang w:val="ar_AE" w:bidi="ar_AE"/>
+        </w:rPr>
+        <w:t>)، جعلَ بولسُ تيموثاوس يَختتن. كان اليهود يعتبرون تيموثاوس من عِرقهم لأن أمه كانت يهوديَّة (</w:t>
+      </w:r>
+      <w:r>
+        <w:rPr>
+          <w:rtl/>
+          <w:cs/>
+          <w:lang w:val="ar_AE" w:bidi="ar_AE"/>
+        </w:rPr>
+        <w:t>أعمال الرسل 16: 1، 2</w:t>
+      </w:r>
+      <w:r>
+        <w:rPr>
+          <w:rtl/>
+          <w:cs/>
+          <w:lang w:val="ar_AE" w:bidi="ar_AE"/>
+        </w:rPr>
+        <w:t xml:space="preserve">). لكن بولس قاوم المحاولات لِجعل تيطس يَختتن، لأنه كان أُمميًا </w:t>
+      </w:r>
+      <w:r>
+        <w:rPr>
+          <w:rtl/>
+          <w:cs/>
+          <w:lang w:val="ar_AE" w:bidi="ar_AE"/>
+        </w:rPr>
+        <w:t>غلاطية 2: 3</w:t>
+      </w:r>
+      <w:r>
+        <w:rPr>
+          <w:rtl/>
+          <w:cs/>
+          <w:lang w:val="ar_AE" w:bidi="ar_AE"/>
+        </w:rPr>
+        <w:t>). من الواضح أن بولس سمحَ للمؤمنين اليهود بأن يَختنوا أبناءهم (</w:t>
+      </w:r>
+      <w:r>
+        <w:rPr>
+          <w:rtl/>
+          <w:cs/>
+          <w:lang w:val="ar_AE" w:bidi="ar_AE"/>
+        </w:rPr>
+        <w:t>أعمال الرسل 21:21</w:t>
+      </w:r>
+      <w:r>
+        <w:rPr>
+          <w:rtl/>
+          <w:cs/>
+          <w:lang w:val="ar_AE" w:bidi="ar_AE"/>
+        </w:rPr>
+        <w:t>).</w:t>
+      </w:r>
+    </w:p>
+    <w:p>
+      <w:pPr>
+        <w:bidi/>
+      </w:pPr>
+      <w:r>
+        <w:rPr>
+          <w:rtl/>
+          <w:cs/>
+          <w:lang w:val="ar_AE" w:bidi="ar_AE"/>
+        </w:rPr>
+      </w:r>
+      <w:r>
+        <w:rPr>
+          <w:rtl/>
+          <w:cs/>
+          <w:lang w:val="ar_AE" w:bidi="ar_AE"/>
+        </w:rPr>
+        <w:t>مع ذلك، انتقدَ بولسُ الذين جادلوا بأنه يجب أن يَختتن المؤمنون الغلاطيون وأن يحفظوا الناموس بأنهم أنفسهم لم يحفظوا الناموس بل أرادوا أن يتفاخروا في جسد الغلاطيين وأن يتجنبوا الاضطهاد من أجل صليب المسيح (</w:t>
+      </w:r>
+      <w:r>
+        <w:rPr>
+          <w:rtl/>
+          <w:cs/>
+          <w:lang w:val="ar_AE" w:bidi="ar_AE"/>
+        </w:rPr>
+        <w:t>غلاطية 6: 12، 13</w:t>
+      </w:r>
+      <w:r>
+        <w:rPr>
+          <w:rtl/>
+          <w:cs/>
+          <w:lang w:val="ar_AE" w:bidi="ar_AE"/>
+        </w:rPr>
+        <w:t>) — الاضطهاد الذي كان بولس مستعداً لتحمله (</w:t>
+      </w:r>
+      <w:r>
+        <w:rPr>
+          <w:rtl/>
+          <w:cs/>
+          <w:lang w:val="ar_AE" w:bidi="ar_AE"/>
+        </w:rPr>
+        <w:t>5:11</w:t>
+      </w:r>
+      <w:r>
+        <w:rPr>
+          <w:rtl/>
+          <w:cs/>
+          <w:lang w:val="ar_AE" w:bidi="ar_AE"/>
+        </w:rPr>
+        <w:t>). على سبيل الجدال، اعترفَ بالافتراض الفريسي بأن الخلاص يمكن أن يَتحقق من خلال حِفظ الناموس، أعلنَ بولس أن الذين اختتنوا يجب أن يطيعوا كل الناموس (</w:t>
+      </w:r>
+      <w:r>
+        <w:rPr>
+          <w:rtl/>
+          <w:cs/>
+          <w:lang w:val="ar_AE" w:bidi="ar_AE"/>
+        </w:rPr>
+        <w:t>5: 2، 3</w:t>
+      </w:r>
+      <w:r>
+        <w:rPr>
+          <w:rtl/>
+          <w:cs/>
+          <w:lang w:val="ar_AE" w:bidi="ar_AE"/>
+        </w:rPr>
+        <w:t xml:space="preserve">). لن "يَنفعَ المسيحُ" أولئك الذين "يَتبررون بالناموس"؛ إن هذه المحاولة للتبرير بالأعمال ستُثبتْ أن الغلاطيين "انقطعوا عن المسيح،" إذ أنهم "سقطوا من النعمة" (آية </w:t>
+      </w:r>
+      <w:r>
+        <w:rPr>
+          <w:rtl/>
+          <w:cs/>
+          <w:lang w:val="ar_AE" w:bidi="ar_AE"/>
+        </w:rPr>
+        <w:t>2–4</w:t>
+      </w:r>
+      <w:r>
+        <w:rPr>
+          <w:rtl/>
+          <w:cs/>
+          <w:lang w:val="ar_AE" w:bidi="ar_AE"/>
+        </w:rPr>
+        <w:t>). كان هؤلاء المسيحيون يتعرضون للإغراء بأن يَتجهوا نحو "إنجيلٍ آخر" (</w:t>
+      </w:r>
+      <w:r>
+        <w:rPr>
+          <w:rtl/>
+          <w:cs/>
+          <w:lang w:val="ar_AE" w:bidi="ar_AE"/>
+        </w:rPr>
+        <w:t>1: 6، 7</w:t>
+      </w:r>
+      <w:r>
+        <w:rPr>
+          <w:rtl/>
+          <w:cs/>
+          <w:lang w:val="ar_AE" w:bidi="ar_AE"/>
+        </w:rPr>
+        <w:t>).</w:t>
+      </w:r>
+    </w:p>
+    <w:p>
+      <w:pPr>
+        <w:bidi/>
+      </w:pPr>
+      <w:r>
+        <w:rPr>
+          <w:rtl/>
+          <w:cs/>
+          <w:lang w:val="ar_AE" w:bidi="ar_AE"/>
+        </w:rPr>
+      </w:r>
+      <w:r>
+        <w:rPr>
+          <w:rtl/>
+          <w:cs/>
+          <w:lang w:val="ar_AE" w:bidi="ar_AE"/>
+        </w:rPr>
+        <w:t>بسبب التهديد الخطير الذي شكَّله المُهوِّدون لإنجيل النعمة المجانيَّة، تمَّنى بولسُ أن الذين يُقلقون الغلاطيين "يَقطعوا" أنفسهم (</w:t>
+      </w:r>
+      <w:r>
+        <w:rPr>
+          <w:rtl/>
+          <w:cs/>
+          <w:lang w:val="ar_AE" w:bidi="ar_AE"/>
+        </w:rPr>
+        <w:t>غلاطية 5: 12</w:t>
+      </w:r>
+      <w:r>
+        <w:rPr>
+          <w:rtl/>
+          <w:cs/>
+          <w:lang w:val="ar_AE" w:bidi="ar_AE"/>
+        </w:rPr>
+        <w:t>). أطلقَ على المُهوِّدين تعبير "الكلاب" و"فَعلة الشر،" مؤكدًا على أن المسيحيين هم "الختان الحقيقي،" لأنهم يعبدون الله بالروح، ويفتخرون في المسيح يسوع، ولا يَتكلون على الأعمال البشريَّة لينالوا الخلاص عن استحقاق (</w:t>
+      </w:r>
+      <w:r>
+        <w:rPr>
+          <w:rtl/>
+          <w:cs/>
+          <w:lang w:val="ar_AE" w:bidi="ar_AE"/>
+        </w:rPr>
+        <w:t>فيلبي 3: 2، 3</w:t>
+      </w:r>
+      <w:r>
+        <w:rPr>
+          <w:rtl/>
+          <w:cs/>
+          <w:lang w:val="ar_AE" w:bidi="ar_AE"/>
+        </w:rPr>
+        <w:t>).</w:t>
+      </w:r>
+    </w:p>
+    <w:p>
+      <w:pPr>
+        <w:bidi/>
+      </w:pPr>
+      <w:r>
+        <w:rPr>
+          <w:rtl/>
+          <w:cs/>
+          <w:lang w:val="ar_AE" w:bidi="ar_AE"/>
+        </w:rPr>
+      </w:r>
+      <w:r>
+        <w:rPr>
+          <w:rtl/>
+          <w:cs/>
+          <w:lang w:val="ar_AE" w:bidi="ar_AE"/>
+        </w:rPr>
+        <w:t>علِّم بولسُ بأن الختان كان بالتأكيد ذا قيمةٍ لليهود، لأنه كان العلامة على أنهم استؤمنوا على "أقوال الله،" أي كلمة الله المُتعلِّقة بوعد الخلاص (</w:t>
+      </w:r>
+      <w:r>
+        <w:rPr>
+          <w:rtl/>
+          <w:cs/>
+          <w:lang w:val="ar_AE" w:bidi="ar_AE"/>
+        </w:rPr>
+        <w:t>رومية 3: 1–3</w:t>
+      </w:r>
+      <w:r>
+        <w:rPr>
+          <w:rtl/>
+          <w:cs/>
+          <w:lang w:val="ar_AE" w:bidi="ar_AE"/>
+        </w:rPr>
+        <w:t>). قام بتذكير أهل أفسس المُفتخرين بأنهم باعتبارهم أمميين كانوا ذات يوم "غرباء عن عهود الموعد،" ولم يَحملوا علامة العهد في أجسادهم (</w:t>
+      </w:r>
+      <w:r>
+        <w:rPr>
+          <w:rtl/>
+          <w:cs/>
+          <w:lang w:val="ar_AE" w:bidi="ar_AE"/>
+        </w:rPr>
+        <w:t>أفسس 2: 11، 12</w:t>
+      </w:r>
+      <w:r>
+        <w:rPr>
+          <w:rtl/>
+          <w:cs/>
+          <w:lang w:val="ar_AE" w:bidi="ar_AE"/>
+        </w:rPr>
+        <w:t xml:space="preserve">؛ انظر </w:t>
+      </w:r>
+      <w:r>
+        <w:rPr>
+          <w:rtl/>
+          <w:cs/>
+          <w:lang w:val="ar_AE" w:bidi="ar_AE"/>
+        </w:rPr>
+        <w:t>كولوسي 2: 13</w:t>
+      </w:r>
+      <w:r>
+        <w:rPr>
+          <w:rtl/>
+          <w:cs/>
+          <w:lang w:val="ar_AE" w:bidi="ar_AE"/>
+        </w:rPr>
+        <w:t>). بالمثل، لم يكن لدى اليهود سببًا للكبرياء، لأن العصيان يستطيع أن يَجعل الختان الخارجي يُحسَب غُرلةً (</w:t>
+      </w:r>
+      <w:r>
+        <w:rPr>
+          <w:rtl/>
+          <w:cs/>
+          <w:lang w:val="ar_AE" w:bidi="ar_AE"/>
+        </w:rPr>
+        <w:t>رومية 2: 25</w:t>
+      </w:r>
+      <w:r>
+        <w:rPr>
+          <w:rtl/>
+          <w:cs/>
+          <w:lang w:val="ar_AE" w:bidi="ar_AE"/>
+        </w:rPr>
+        <w:t>).</w:t>
+      </w:r>
+    </w:p>
+    <w:p>
+      <w:pPr>
+        <w:bidi/>
+      </w:pPr>
+      <w:r>
+        <w:rPr>
+          <w:rtl/>
+          <w:cs/>
+          <w:lang w:val="ar_AE" w:bidi="ar_AE"/>
+        </w:rPr>
+      </w:r>
+      <w:r>
+        <w:rPr>
+          <w:rtl/>
+          <w:cs/>
+          <w:lang w:val="ar_AE" w:bidi="ar_AE"/>
+        </w:rPr>
+        <w:t>اتبعَ بولسُ والرُسل الآخرون موسى وأنبياء العهد القديم في تعليمهم أن الختان الحقيقي كان مسألةً قلبيَّة. يذهب تعليمُ العهد الجديد إلى أبعد من ذلك حيث يؤكِّد على أن المؤمن الأمين، وإن كان غير مختون جسديًا، يَعتبره اللهُ مختونًا، "لأَنَّ الْيَهُودِيَّ فِي الظَّاهِرِ لَيْسَ هُوَ يَهُودِيًا وَلاَ الْخِتَانُ الَّذِي فِي الظَّاهِرِ فِي اللَّحْمِ خِتَانًا" (</w:t>
+      </w:r>
+      <w:r>
+        <w:rPr>
+          <w:rtl/>
+          <w:cs/>
+          <w:lang w:val="ar_AE" w:bidi="ar_AE"/>
+        </w:rPr>
+        <w:t>رومية 2:28</w:t>
+      </w:r>
+      <w:r>
+        <w:rPr>
+          <w:rtl/>
+          <w:cs/>
+          <w:lang w:val="ar_AE" w:bidi="ar_AE"/>
+        </w:rPr>
+        <w:t>). يَخلُص اليهود والأمم بالنعمة (</w:t>
+      </w:r>
+      <w:r>
+        <w:rPr>
+          <w:rtl/>
+          <w:cs/>
+          <w:lang w:val="ar_AE" w:bidi="ar_AE"/>
+        </w:rPr>
+        <w:t>أعمال الرسل 15: 11</w:t>
+      </w:r>
+      <w:r>
+        <w:rPr>
+          <w:rtl/>
+          <w:cs/>
+          <w:lang w:val="ar_AE" w:bidi="ar_AE"/>
+        </w:rPr>
+        <w:t>)، ويَتبرَّر المختونون وغير المختونين على حد سواء على أساس إيمانهم، بمعزل عن أعمال الناموس (</w:t>
+      </w:r>
+      <w:r>
+        <w:rPr>
+          <w:rtl/>
+          <w:cs/>
+          <w:lang w:val="ar_AE" w:bidi="ar_AE"/>
+        </w:rPr>
+        <w:t>رومية 3:28–30</w:t>
+      </w:r>
+      <w:r>
+        <w:rPr>
+          <w:rtl/>
+          <w:cs/>
+          <w:lang w:val="ar_AE" w:bidi="ar_AE"/>
+        </w:rPr>
+        <w:t>).</w:t>
+      </w:r>
+    </w:p>
+    <w:p>
+      <w:pPr>
+        <w:bidi/>
+      </w:pPr>
+      <w:r>
+        <w:rPr>
+          <w:rtl/>
+          <w:cs/>
+          <w:lang w:val="ar_AE" w:bidi="ar_AE"/>
+        </w:rPr>
+      </w:r>
+      <w:r>
+        <w:rPr>
+          <w:rtl/>
+          <w:cs/>
+          <w:lang w:val="ar_AE" w:bidi="ar_AE"/>
+        </w:rPr>
+        <w:t>كان إبراهيم مثالًا لشخص حُسب له إيمانه برًا (</w:t>
+      </w:r>
+      <w:r>
+        <w:rPr>
+          <w:rtl/>
+          <w:cs/>
+          <w:lang w:val="ar_AE" w:bidi="ar_AE"/>
+        </w:rPr>
+        <w:t>رومية 4:3</w:t>
+      </w:r>
+      <w:r>
+        <w:rPr>
+          <w:rtl/>
+          <w:cs/>
+          <w:lang w:val="ar_AE" w:bidi="ar_AE"/>
+        </w:rPr>
+        <w:t xml:space="preserve">؛ انظر </w:t>
+      </w:r>
+      <w:r>
+        <w:rPr>
+          <w:rtl/>
+          <w:cs/>
+          <w:lang w:val="ar_AE" w:bidi="ar_AE"/>
+        </w:rPr>
+        <w:t>تكوين 15: 6</w:t>
+      </w:r>
+      <w:r>
+        <w:rPr>
+          <w:rtl/>
+          <w:cs/>
+          <w:lang w:val="ar_AE" w:bidi="ar_AE"/>
+        </w:rPr>
+        <w:t>). جادلَ بولسُ بأن كلاً من الأمم واليهود يَتبرَّرون بالإيمان، لأن إبراهيم حُسب بارًا قبل أن يُختَن. لم يَختتن إبراهيم للحصول على البِر، بل باعتبار الختان علامةً أو ختمًا للبِر الذي ناله بالإيمان وهو لا يزال غير مختون. لذلك يُعد إبراهيم أبًا لكل الذين يؤمنون وهم غير مختونين، وللمختونين ولكنهم يتبعون أيضًا مِثال إيمان إبراهيم (</w:t>
+      </w:r>
+      <w:r>
+        <w:rPr>
+          <w:rtl/>
+          <w:cs/>
+          <w:lang w:val="ar_AE" w:bidi="ar_AE"/>
+        </w:rPr>
+        <w:t>رومية 4: 9–12</w:t>
+      </w:r>
+      <w:r>
+        <w:rPr>
+          <w:rtl/>
+          <w:cs/>
+          <w:lang w:val="ar_AE" w:bidi="ar_AE"/>
+        </w:rPr>
+        <w:t xml:space="preserve">؛ انظر </w:t>
+      </w:r>
+      <w:r>
+        <w:rPr>
+          <w:rtl/>
+          <w:cs/>
+          <w:lang w:val="ar_AE" w:bidi="ar_AE"/>
+        </w:rPr>
+        <w:t>غلاطية 3: 6–9</w:t>
+      </w:r>
+      <w:r>
+        <w:rPr>
+          <w:rtl/>
+          <w:cs/>
+          <w:lang w:val="ar_AE" w:bidi="ar_AE"/>
+        </w:rPr>
+        <w:t>).</w:t>
       </w:r>
     </w:p>
     <w:p>

</xml_diff>